<commit_message>
feat: add initial frontend and backend implementation
</commit_message>
<xml_diff>
--- a/需求分析_word/小组协作工具箱系统需求规格说明书_第4小组.docx
+++ b/需求分析_word/小组协作工具箱系统需求规格说明书_第4小组.docx
@@ -78,9 +78,16 @@
     </w:p>
     <w:tbl>
       <w:tblPr>
-        <w:tblStyle w:val="a9"/>
         <w:tblW w:w="0" w:type="auto"/>
         <w:jc w:val="center"/>
+        <w:tblBorders>
+          <w:top w:val="single" w:sz="4" w:space="0" w:color="auto"/>
+          <w:left w:val="single" w:sz="4" w:space="0" w:color="auto"/>
+          <w:bottom w:val="single" w:sz="4" w:space="0" w:color="auto"/>
+          <w:right w:val="single" w:sz="4" w:space="0" w:color="auto"/>
+          <w:insideH w:val="single" w:sz="4" w:space="0" w:color="auto"/>
+          <w:insideV w:val="single" w:sz="4" w:space="0" w:color="auto"/>
+        </w:tblBorders>
         <w:tblLayout w:type="fixed"/>
         <w:tblLook w:val="04A0" w:firstRow="1" w:lastRow="0" w:firstColumn="1" w:lastColumn="0" w:noHBand="0" w:noVBand="1"/>
       </w:tblPr>
@@ -140,7 +147,14 @@
               <w:rPr>
                 <w:sz w:val="23"/>
               </w:rPr>
-              <w:t>项目组成员：待填写</w:t>
+              <w:t>项目组成员：</w:t>
+            </w:r>
+            <w:r>
+              <w:rPr>
+                <w:rFonts w:hint="eastAsia"/>
+                <w:sz w:val="23"/>
+              </w:rPr>
+              <w:t>古淞滔</w:t>
             </w:r>
           </w:p>
         </w:tc>
@@ -469,9 +483,16 @@
     </w:p>
     <w:tbl>
       <w:tblPr>
-        <w:tblStyle w:val="a9"/>
         <w:tblW w:w="0" w:type="auto"/>
         <w:jc w:val="center"/>
+        <w:tblBorders>
+          <w:top w:val="single" w:sz="4" w:space="0" w:color="auto"/>
+          <w:left w:val="single" w:sz="4" w:space="0" w:color="auto"/>
+          <w:bottom w:val="single" w:sz="4" w:space="0" w:color="auto"/>
+          <w:right w:val="single" w:sz="4" w:space="0" w:color="auto"/>
+          <w:insideH w:val="single" w:sz="4" w:space="0" w:color="auto"/>
+          <w:insideV w:val="single" w:sz="4" w:space="0" w:color="auto"/>
+        </w:tblBorders>
         <w:tblLayout w:type="fixed"/>
         <w:tblLook w:val="04A0" w:firstRow="1" w:lastRow="0" w:firstColumn="1" w:lastColumn="0" w:noHBand="0" w:noVBand="1"/>
       </w:tblPr>
@@ -1082,9 +1103,8 @@
           <w:tab w:val="right" w:leader="dot" w:pos="8290"/>
         </w:tabs>
         <w:rPr>
-          <w:rFonts w:asciiTheme="minorHAnsi" w:eastAsiaTheme="minorEastAsia" w:hAnsiTheme="minorHAnsi" w:cstheme="minorBidi" w:hint="eastAsia"/>
+          <w:rFonts w:ascii="等线" w:eastAsia="等线" w:hAnsi="等线" w:hint="eastAsia"/>
           <w:noProof/>
-          <w14:ligatures w14:val="standardContextual"/>
         </w:rPr>
       </w:pPr>
       <w:r>
@@ -1184,10 +1204,9 @@
         </w:tabs>
         <w:ind w:left="480"/>
         <w:rPr>
-          <w:rFonts w:asciiTheme="minorHAnsi" w:eastAsiaTheme="minorEastAsia" w:hAnsiTheme="minorHAnsi" w:cstheme="minorBidi" w:hint="eastAsia"/>
+          <w:rFonts w:ascii="等线" w:eastAsia="等线" w:hAnsi="等线" w:hint="eastAsia"/>
           <w:noProof/>
           <w:sz w:val="22"/>
-          <w14:ligatures w14:val="standardContextual"/>
         </w:rPr>
       </w:pPr>
       <w:hyperlink w:anchor="_Toc240898496" w:history="1">
@@ -1278,10 +1297,9 @@
         </w:tabs>
         <w:ind w:left="480"/>
         <w:rPr>
-          <w:rFonts w:asciiTheme="minorHAnsi" w:eastAsiaTheme="minorEastAsia" w:hAnsiTheme="minorHAnsi" w:cstheme="minorBidi" w:hint="eastAsia"/>
+          <w:rFonts w:ascii="等线" w:eastAsia="等线" w:hAnsi="等线" w:hint="eastAsia"/>
           <w:noProof/>
           <w:sz w:val="22"/>
-          <w14:ligatures w14:val="standardContextual"/>
         </w:rPr>
       </w:pPr>
       <w:hyperlink w:anchor="_Toc240898497" w:history="1">
@@ -1372,10 +1390,9 @@
         </w:tabs>
         <w:ind w:left="480"/>
         <w:rPr>
-          <w:rFonts w:asciiTheme="minorHAnsi" w:eastAsiaTheme="minorEastAsia" w:hAnsiTheme="minorHAnsi" w:cstheme="minorBidi" w:hint="eastAsia"/>
+          <w:rFonts w:ascii="等线" w:eastAsia="等线" w:hAnsi="等线" w:hint="eastAsia"/>
           <w:noProof/>
           <w:sz w:val="22"/>
-          <w14:ligatures w14:val="standardContextual"/>
         </w:rPr>
       </w:pPr>
       <w:hyperlink w:anchor="_Toc240898498" w:history="1">
@@ -1466,10 +1483,9 @@
         </w:tabs>
         <w:ind w:left="480"/>
         <w:rPr>
-          <w:rFonts w:asciiTheme="minorHAnsi" w:eastAsiaTheme="minorEastAsia" w:hAnsiTheme="minorHAnsi" w:cstheme="minorBidi" w:hint="eastAsia"/>
+          <w:rFonts w:ascii="等线" w:eastAsia="等线" w:hAnsi="等线" w:hint="eastAsia"/>
           <w:noProof/>
           <w:sz w:val="22"/>
-          <w14:ligatures w14:val="standardContextual"/>
         </w:rPr>
       </w:pPr>
       <w:hyperlink w:anchor="_Toc240898499" w:history="1">
@@ -1560,10 +1576,9 @@
         </w:tabs>
         <w:ind w:left="480"/>
         <w:rPr>
-          <w:rFonts w:asciiTheme="minorHAnsi" w:eastAsiaTheme="minorEastAsia" w:hAnsiTheme="minorHAnsi" w:cstheme="minorBidi" w:hint="eastAsia"/>
+          <w:rFonts w:ascii="等线" w:eastAsia="等线" w:hAnsi="等线" w:hint="eastAsia"/>
           <w:noProof/>
           <w:sz w:val="22"/>
-          <w14:ligatures w14:val="standardContextual"/>
         </w:rPr>
       </w:pPr>
       <w:hyperlink w:anchor="_Toc240898500" w:history="1">
@@ -1654,10 +1669,9 @@
         </w:tabs>
         <w:ind w:left="480"/>
         <w:rPr>
-          <w:rFonts w:asciiTheme="minorHAnsi" w:eastAsiaTheme="minorEastAsia" w:hAnsiTheme="minorHAnsi" w:cstheme="minorBidi" w:hint="eastAsia"/>
+          <w:rFonts w:ascii="等线" w:eastAsia="等线" w:hAnsi="等线" w:hint="eastAsia"/>
           <w:noProof/>
           <w:sz w:val="22"/>
-          <w14:ligatures w14:val="standardContextual"/>
         </w:rPr>
       </w:pPr>
       <w:hyperlink w:anchor="_Toc240898501" w:history="1">
@@ -1747,9 +1761,8 @@
           <w:tab w:val="right" w:leader="dot" w:pos="8290"/>
         </w:tabs>
         <w:rPr>
-          <w:rFonts w:asciiTheme="minorHAnsi" w:eastAsiaTheme="minorEastAsia" w:hAnsiTheme="minorHAnsi" w:cstheme="minorBidi" w:hint="eastAsia"/>
+          <w:rFonts w:ascii="等线" w:eastAsia="等线" w:hAnsi="等线" w:hint="eastAsia"/>
           <w:noProof/>
-          <w14:ligatures w14:val="standardContextual"/>
         </w:rPr>
       </w:pPr>
       <w:hyperlink w:anchor="_Toc240898502" w:history="1">
@@ -1840,10 +1853,9 @@
         </w:tabs>
         <w:ind w:left="480"/>
         <w:rPr>
-          <w:rFonts w:asciiTheme="minorHAnsi" w:eastAsiaTheme="minorEastAsia" w:hAnsiTheme="minorHAnsi" w:cstheme="minorBidi" w:hint="eastAsia"/>
+          <w:rFonts w:ascii="等线" w:eastAsia="等线" w:hAnsi="等线" w:hint="eastAsia"/>
           <w:noProof/>
           <w:sz w:val="22"/>
-          <w14:ligatures w14:val="standardContextual"/>
         </w:rPr>
       </w:pPr>
       <w:hyperlink w:anchor="_Toc240898503" w:history="1">
@@ -1934,10 +1946,9 @@
         </w:tabs>
         <w:ind w:left="480"/>
         <w:rPr>
-          <w:rFonts w:asciiTheme="minorHAnsi" w:eastAsiaTheme="minorEastAsia" w:hAnsiTheme="minorHAnsi" w:cstheme="minorBidi" w:hint="eastAsia"/>
+          <w:rFonts w:ascii="等线" w:eastAsia="等线" w:hAnsi="等线" w:hint="eastAsia"/>
           <w:noProof/>
           <w:sz w:val="22"/>
-          <w14:ligatures w14:val="standardContextual"/>
         </w:rPr>
       </w:pPr>
       <w:hyperlink w:anchor="_Toc240898504" w:history="1">
@@ -2028,10 +2039,9 @@
         </w:tabs>
         <w:ind w:left="480"/>
         <w:rPr>
-          <w:rFonts w:asciiTheme="minorHAnsi" w:eastAsiaTheme="minorEastAsia" w:hAnsiTheme="minorHAnsi" w:cstheme="minorBidi" w:hint="eastAsia"/>
+          <w:rFonts w:ascii="等线" w:eastAsia="等线" w:hAnsi="等线" w:hint="eastAsia"/>
           <w:noProof/>
           <w:sz w:val="22"/>
-          <w14:ligatures w14:val="standardContextual"/>
         </w:rPr>
       </w:pPr>
       <w:hyperlink w:anchor="_Toc240898505" w:history="1">
@@ -2122,10 +2132,9 @@
         </w:tabs>
         <w:ind w:left="480"/>
         <w:rPr>
-          <w:rFonts w:asciiTheme="minorHAnsi" w:eastAsiaTheme="minorEastAsia" w:hAnsiTheme="minorHAnsi" w:cstheme="minorBidi" w:hint="eastAsia"/>
+          <w:rFonts w:ascii="等线" w:eastAsia="等线" w:hAnsi="等线" w:hint="eastAsia"/>
           <w:noProof/>
           <w:sz w:val="22"/>
-          <w14:ligatures w14:val="standardContextual"/>
         </w:rPr>
       </w:pPr>
       <w:hyperlink w:anchor="_Toc240898506" w:history="1">
@@ -2215,9 +2224,8 @@
           <w:tab w:val="right" w:leader="dot" w:pos="8290"/>
         </w:tabs>
         <w:rPr>
-          <w:rFonts w:asciiTheme="minorHAnsi" w:eastAsiaTheme="minorEastAsia" w:hAnsiTheme="minorHAnsi" w:cstheme="minorBidi" w:hint="eastAsia"/>
+          <w:rFonts w:ascii="等线" w:eastAsia="等线" w:hAnsi="等线" w:hint="eastAsia"/>
           <w:noProof/>
-          <w14:ligatures w14:val="standardContextual"/>
         </w:rPr>
       </w:pPr>
       <w:hyperlink w:anchor="_Toc240898507" w:history="1">
@@ -2308,10 +2316,9 @@
         </w:tabs>
         <w:ind w:left="480"/>
         <w:rPr>
-          <w:rFonts w:asciiTheme="minorHAnsi" w:eastAsiaTheme="minorEastAsia" w:hAnsiTheme="minorHAnsi" w:cstheme="minorBidi" w:hint="eastAsia"/>
+          <w:rFonts w:ascii="等线" w:eastAsia="等线" w:hAnsi="等线" w:hint="eastAsia"/>
           <w:noProof/>
           <w:sz w:val="22"/>
-          <w14:ligatures w14:val="standardContextual"/>
         </w:rPr>
       </w:pPr>
       <w:hyperlink w:anchor="_Toc240898508" w:history="1">
@@ -2402,10 +2409,9 @@
         </w:tabs>
         <w:ind w:left="480"/>
         <w:rPr>
-          <w:rFonts w:asciiTheme="minorHAnsi" w:eastAsiaTheme="minorEastAsia" w:hAnsiTheme="minorHAnsi" w:cstheme="minorBidi" w:hint="eastAsia"/>
+          <w:rFonts w:ascii="等线" w:eastAsia="等线" w:hAnsi="等线" w:hint="eastAsia"/>
           <w:noProof/>
           <w:sz w:val="22"/>
-          <w14:ligatures w14:val="standardContextual"/>
         </w:rPr>
       </w:pPr>
       <w:hyperlink w:anchor="_Toc240898509" w:history="1">
@@ -2496,10 +2502,9 @@
         </w:tabs>
         <w:ind w:left="480"/>
         <w:rPr>
-          <w:rFonts w:asciiTheme="minorHAnsi" w:eastAsiaTheme="minorEastAsia" w:hAnsiTheme="minorHAnsi" w:cstheme="minorBidi" w:hint="eastAsia"/>
+          <w:rFonts w:ascii="等线" w:eastAsia="等线" w:hAnsi="等线" w:hint="eastAsia"/>
           <w:noProof/>
           <w:sz w:val="22"/>
-          <w14:ligatures w14:val="standardContextual"/>
         </w:rPr>
       </w:pPr>
       <w:hyperlink w:anchor="_Toc240898510" w:history="1">
@@ -2590,10 +2595,9 @@
         </w:tabs>
         <w:ind w:left="960"/>
         <w:rPr>
-          <w:rFonts w:asciiTheme="minorHAnsi" w:eastAsiaTheme="minorEastAsia" w:hAnsiTheme="minorHAnsi" w:cstheme="minorBidi" w:hint="eastAsia"/>
+          <w:rFonts w:ascii="等线" w:eastAsia="等线" w:hAnsi="等线" w:hint="eastAsia"/>
           <w:noProof/>
           <w:sz w:val="22"/>
-          <w14:ligatures w14:val="standardContextual"/>
         </w:rPr>
       </w:pPr>
       <w:hyperlink w:anchor="_Toc240898511" w:history="1">
@@ -2684,10 +2688,9 @@
         </w:tabs>
         <w:ind w:left="960"/>
         <w:rPr>
-          <w:rFonts w:asciiTheme="minorHAnsi" w:eastAsiaTheme="minorEastAsia" w:hAnsiTheme="minorHAnsi" w:cstheme="minorBidi" w:hint="eastAsia"/>
+          <w:rFonts w:ascii="等线" w:eastAsia="等线" w:hAnsi="等线" w:hint="eastAsia"/>
           <w:noProof/>
           <w:sz w:val="22"/>
-          <w14:ligatures w14:val="standardContextual"/>
         </w:rPr>
       </w:pPr>
       <w:hyperlink w:anchor="_Toc240898512" w:history="1">
@@ -2778,10 +2781,9 @@
         </w:tabs>
         <w:ind w:left="960"/>
         <w:rPr>
-          <w:rFonts w:asciiTheme="minorHAnsi" w:eastAsiaTheme="minorEastAsia" w:hAnsiTheme="minorHAnsi" w:cstheme="minorBidi" w:hint="eastAsia"/>
+          <w:rFonts w:ascii="等线" w:eastAsia="等线" w:hAnsi="等线" w:hint="eastAsia"/>
           <w:noProof/>
           <w:sz w:val="22"/>
-          <w14:ligatures w14:val="standardContextual"/>
         </w:rPr>
       </w:pPr>
       <w:hyperlink w:anchor="_Toc240898513" w:history="1">
@@ -2872,10 +2874,9 @@
         </w:tabs>
         <w:ind w:left="960"/>
         <w:rPr>
-          <w:rFonts w:asciiTheme="minorHAnsi" w:eastAsiaTheme="minorEastAsia" w:hAnsiTheme="minorHAnsi" w:cstheme="minorBidi" w:hint="eastAsia"/>
+          <w:rFonts w:ascii="等线" w:eastAsia="等线" w:hAnsi="等线" w:hint="eastAsia"/>
           <w:noProof/>
           <w:sz w:val="22"/>
-          <w14:ligatures w14:val="standardContextual"/>
         </w:rPr>
       </w:pPr>
       <w:hyperlink w:anchor="_Toc240898514" w:history="1">
@@ -2966,10 +2967,9 @@
         </w:tabs>
         <w:ind w:left="960"/>
         <w:rPr>
-          <w:rFonts w:asciiTheme="minorHAnsi" w:eastAsiaTheme="minorEastAsia" w:hAnsiTheme="minorHAnsi" w:cstheme="minorBidi" w:hint="eastAsia"/>
+          <w:rFonts w:ascii="等线" w:eastAsia="等线" w:hAnsi="等线" w:hint="eastAsia"/>
           <w:noProof/>
           <w:sz w:val="22"/>
-          <w14:ligatures w14:val="standardContextual"/>
         </w:rPr>
       </w:pPr>
       <w:hyperlink w:anchor="_Toc240898515" w:history="1">
@@ -3060,10 +3060,9 @@
         </w:tabs>
         <w:ind w:left="960"/>
         <w:rPr>
-          <w:rFonts w:asciiTheme="minorHAnsi" w:eastAsiaTheme="minorEastAsia" w:hAnsiTheme="minorHAnsi" w:cstheme="minorBidi" w:hint="eastAsia"/>
+          <w:rFonts w:ascii="等线" w:eastAsia="等线" w:hAnsi="等线" w:hint="eastAsia"/>
           <w:noProof/>
           <w:sz w:val="22"/>
-          <w14:ligatures w14:val="standardContextual"/>
         </w:rPr>
       </w:pPr>
       <w:hyperlink w:anchor="_Toc240898516" w:history="1">
@@ -3154,10 +3153,9 @@
         </w:tabs>
         <w:ind w:left="960"/>
         <w:rPr>
-          <w:rFonts w:asciiTheme="minorHAnsi" w:eastAsiaTheme="minorEastAsia" w:hAnsiTheme="minorHAnsi" w:cstheme="minorBidi" w:hint="eastAsia"/>
+          <w:rFonts w:ascii="等线" w:eastAsia="等线" w:hAnsi="等线" w:hint="eastAsia"/>
           <w:noProof/>
           <w:sz w:val="22"/>
-          <w14:ligatures w14:val="standardContextual"/>
         </w:rPr>
       </w:pPr>
       <w:hyperlink w:anchor="_Toc240898517" w:history="1">
@@ -3248,10 +3246,9 @@
         </w:tabs>
         <w:ind w:left="960"/>
         <w:rPr>
-          <w:rFonts w:asciiTheme="minorHAnsi" w:eastAsiaTheme="minorEastAsia" w:hAnsiTheme="minorHAnsi" w:cstheme="minorBidi" w:hint="eastAsia"/>
+          <w:rFonts w:ascii="等线" w:eastAsia="等线" w:hAnsi="等线" w:hint="eastAsia"/>
           <w:noProof/>
           <w:sz w:val="22"/>
-          <w14:ligatures w14:val="standardContextual"/>
         </w:rPr>
       </w:pPr>
       <w:hyperlink w:anchor="_Toc240898518" w:history="1">
@@ -3342,10 +3339,9 @@
         </w:tabs>
         <w:ind w:left="960"/>
         <w:rPr>
-          <w:rFonts w:asciiTheme="minorHAnsi" w:eastAsiaTheme="minorEastAsia" w:hAnsiTheme="minorHAnsi" w:cstheme="minorBidi" w:hint="eastAsia"/>
+          <w:rFonts w:ascii="等线" w:eastAsia="等线" w:hAnsi="等线" w:hint="eastAsia"/>
           <w:noProof/>
           <w:sz w:val="22"/>
-          <w14:ligatures w14:val="standardContextual"/>
         </w:rPr>
       </w:pPr>
       <w:hyperlink w:anchor="_Toc240898519" w:history="1">
@@ -3435,9 +3431,8 @@
           <w:tab w:val="right" w:leader="dot" w:pos="8290"/>
         </w:tabs>
         <w:rPr>
-          <w:rFonts w:asciiTheme="minorHAnsi" w:eastAsiaTheme="minorEastAsia" w:hAnsiTheme="minorHAnsi" w:cstheme="minorBidi" w:hint="eastAsia"/>
+          <w:rFonts w:ascii="等线" w:eastAsia="等线" w:hAnsi="等线" w:hint="eastAsia"/>
           <w:noProof/>
-          <w14:ligatures w14:val="standardContextual"/>
         </w:rPr>
       </w:pPr>
       <w:hyperlink w:anchor="_Toc240898520" w:history="1">
@@ -3528,10 +3523,9 @@
         </w:tabs>
         <w:ind w:left="480"/>
         <w:rPr>
-          <w:rFonts w:asciiTheme="minorHAnsi" w:eastAsiaTheme="minorEastAsia" w:hAnsiTheme="minorHAnsi" w:cstheme="minorBidi" w:hint="eastAsia"/>
+          <w:rFonts w:ascii="等线" w:eastAsia="等线" w:hAnsi="等线" w:hint="eastAsia"/>
           <w:noProof/>
           <w:sz w:val="22"/>
-          <w14:ligatures w14:val="standardContextual"/>
         </w:rPr>
       </w:pPr>
       <w:hyperlink w:anchor="_Toc240898521" w:history="1">
@@ -3622,10 +3616,9 @@
         </w:tabs>
         <w:ind w:left="960"/>
         <w:rPr>
-          <w:rFonts w:asciiTheme="minorHAnsi" w:eastAsiaTheme="minorEastAsia" w:hAnsiTheme="minorHAnsi" w:cstheme="minorBidi" w:hint="eastAsia"/>
+          <w:rFonts w:ascii="等线" w:eastAsia="等线" w:hAnsi="等线" w:hint="eastAsia"/>
           <w:noProof/>
           <w:sz w:val="22"/>
-          <w14:ligatures w14:val="standardContextual"/>
         </w:rPr>
       </w:pPr>
       <w:hyperlink w:anchor="_Toc240898522" w:history="1">
@@ -3716,10 +3709,9 @@
         </w:tabs>
         <w:ind w:left="960"/>
         <w:rPr>
-          <w:rFonts w:asciiTheme="minorHAnsi" w:eastAsiaTheme="minorEastAsia" w:hAnsiTheme="minorHAnsi" w:cstheme="minorBidi" w:hint="eastAsia"/>
+          <w:rFonts w:ascii="等线" w:eastAsia="等线" w:hAnsi="等线" w:hint="eastAsia"/>
           <w:noProof/>
           <w:sz w:val="22"/>
-          <w14:ligatures w14:val="standardContextual"/>
         </w:rPr>
       </w:pPr>
       <w:hyperlink w:anchor="_Toc240898523" w:history="1">
@@ -3810,10 +3802,9 @@
         </w:tabs>
         <w:ind w:left="960"/>
         <w:rPr>
-          <w:rFonts w:asciiTheme="minorHAnsi" w:eastAsiaTheme="minorEastAsia" w:hAnsiTheme="minorHAnsi" w:cstheme="minorBidi" w:hint="eastAsia"/>
+          <w:rFonts w:ascii="等线" w:eastAsia="等线" w:hAnsi="等线" w:hint="eastAsia"/>
           <w:noProof/>
           <w:sz w:val="22"/>
-          <w14:ligatures w14:val="standardContextual"/>
         </w:rPr>
       </w:pPr>
       <w:hyperlink w:anchor="_Toc240898524" w:history="1">
@@ -3904,10 +3895,9 @@
         </w:tabs>
         <w:ind w:left="960"/>
         <w:rPr>
-          <w:rFonts w:asciiTheme="minorHAnsi" w:eastAsiaTheme="minorEastAsia" w:hAnsiTheme="minorHAnsi" w:cstheme="minorBidi" w:hint="eastAsia"/>
+          <w:rFonts w:ascii="等线" w:eastAsia="等线" w:hAnsi="等线" w:hint="eastAsia"/>
           <w:noProof/>
           <w:sz w:val="22"/>
-          <w14:ligatures w14:val="standardContextual"/>
         </w:rPr>
       </w:pPr>
       <w:hyperlink w:anchor="_Toc240898525" w:history="1">
@@ -3998,10 +3988,9 @@
         </w:tabs>
         <w:ind w:left="960"/>
         <w:rPr>
-          <w:rFonts w:asciiTheme="minorHAnsi" w:eastAsiaTheme="minorEastAsia" w:hAnsiTheme="minorHAnsi" w:cstheme="minorBidi" w:hint="eastAsia"/>
+          <w:rFonts w:ascii="等线" w:eastAsia="等线" w:hAnsi="等线" w:hint="eastAsia"/>
           <w:noProof/>
           <w:sz w:val="22"/>
-          <w14:ligatures w14:val="standardContextual"/>
         </w:rPr>
       </w:pPr>
       <w:hyperlink w:anchor="_Toc240898526" w:history="1">
@@ -4092,10 +4081,9 @@
         </w:tabs>
         <w:ind w:left="960"/>
         <w:rPr>
-          <w:rFonts w:asciiTheme="minorHAnsi" w:eastAsiaTheme="minorEastAsia" w:hAnsiTheme="minorHAnsi" w:cstheme="minorBidi" w:hint="eastAsia"/>
+          <w:rFonts w:ascii="等线" w:eastAsia="等线" w:hAnsi="等线" w:hint="eastAsia"/>
           <w:noProof/>
           <w:sz w:val="22"/>
-          <w14:ligatures w14:val="standardContextual"/>
         </w:rPr>
       </w:pPr>
       <w:hyperlink w:anchor="_Toc240898527" w:history="1">
@@ -4186,10 +4174,9 @@
         </w:tabs>
         <w:ind w:left="960"/>
         <w:rPr>
-          <w:rFonts w:asciiTheme="minorHAnsi" w:eastAsiaTheme="minorEastAsia" w:hAnsiTheme="minorHAnsi" w:cstheme="minorBidi" w:hint="eastAsia"/>
+          <w:rFonts w:ascii="等线" w:eastAsia="等线" w:hAnsi="等线" w:hint="eastAsia"/>
           <w:noProof/>
           <w:sz w:val="22"/>
-          <w14:ligatures w14:val="standardContextual"/>
         </w:rPr>
       </w:pPr>
       <w:hyperlink w:anchor="_Toc240898528" w:history="1">
@@ -4280,10 +4267,9 @@
         </w:tabs>
         <w:ind w:left="960"/>
         <w:rPr>
-          <w:rFonts w:asciiTheme="minorHAnsi" w:eastAsiaTheme="minorEastAsia" w:hAnsiTheme="minorHAnsi" w:cstheme="minorBidi" w:hint="eastAsia"/>
+          <w:rFonts w:ascii="等线" w:eastAsia="等线" w:hAnsi="等线" w:hint="eastAsia"/>
           <w:noProof/>
           <w:sz w:val="22"/>
-          <w14:ligatures w14:val="standardContextual"/>
         </w:rPr>
       </w:pPr>
       <w:hyperlink w:anchor="_Toc240898529" w:history="1">
@@ -4374,10 +4360,9 @@
         </w:tabs>
         <w:ind w:left="960"/>
         <w:rPr>
-          <w:rFonts w:asciiTheme="minorHAnsi" w:eastAsiaTheme="minorEastAsia" w:hAnsiTheme="minorHAnsi" w:cstheme="minorBidi" w:hint="eastAsia"/>
+          <w:rFonts w:ascii="等线" w:eastAsia="等线" w:hAnsi="等线" w:hint="eastAsia"/>
           <w:noProof/>
           <w:sz w:val="22"/>
-          <w14:ligatures w14:val="standardContextual"/>
         </w:rPr>
       </w:pPr>
       <w:hyperlink w:anchor="_Toc240898530" w:history="1">
@@ -4468,10 +4453,9 @@
         </w:tabs>
         <w:ind w:left="960"/>
         <w:rPr>
-          <w:rFonts w:asciiTheme="minorHAnsi" w:eastAsiaTheme="minorEastAsia" w:hAnsiTheme="minorHAnsi" w:cstheme="minorBidi" w:hint="eastAsia"/>
+          <w:rFonts w:ascii="等线" w:eastAsia="等线" w:hAnsi="等线" w:hint="eastAsia"/>
           <w:noProof/>
           <w:sz w:val="22"/>
-          <w14:ligatures w14:val="standardContextual"/>
         </w:rPr>
       </w:pPr>
       <w:hyperlink w:anchor="_Toc240898531" w:history="1">
@@ -4562,10 +4546,9 @@
         </w:tabs>
         <w:ind w:left="960"/>
         <w:rPr>
-          <w:rFonts w:asciiTheme="minorHAnsi" w:eastAsiaTheme="minorEastAsia" w:hAnsiTheme="minorHAnsi" w:cstheme="minorBidi" w:hint="eastAsia"/>
+          <w:rFonts w:ascii="等线" w:eastAsia="等线" w:hAnsi="等线" w:hint="eastAsia"/>
           <w:noProof/>
           <w:sz w:val="22"/>
-          <w14:ligatures w14:val="standardContextual"/>
         </w:rPr>
       </w:pPr>
       <w:hyperlink w:anchor="_Toc240898532" w:history="1">
@@ -4656,10 +4639,9 @@
         </w:tabs>
         <w:ind w:left="960"/>
         <w:rPr>
-          <w:rFonts w:asciiTheme="minorHAnsi" w:eastAsiaTheme="minorEastAsia" w:hAnsiTheme="minorHAnsi" w:cstheme="minorBidi" w:hint="eastAsia"/>
+          <w:rFonts w:ascii="等线" w:eastAsia="等线" w:hAnsi="等线" w:hint="eastAsia"/>
           <w:noProof/>
           <w:sz w:val="22"/>
-          <w14:ligatures w14:val="standardContextual"/>
         </w:rPr>
       </w:pPr>
       <w:hyperlink w:anchor="_Toc240898533" w:history="1">
@@ -4750,10 +4732,9 @@
         </w:tabs>
         <w:ind w:left="960"/>
         <w:rPr>
-          <w:rFonts w:asciiTheme="minorHAnsi" w:eastAsiaTheme="minorEastAsia" w:hAnsiTheme="minorHAnsi" w:cstheme="minorBidi" w:hint="eastAsia"/>
+          <w:rFonts w:ascii="等线" w:eastAsia="等线" w:hAnsi="等线" w:hint="eastAsia"/>
           <w:noProof/>
           <w:sz w:val="22"/>
-          <w14:ligatures w14:val="standardContextual"/>
         </w:rPr>
       </w:pPr>
       <w:hyperlink w:anchor="_Toc240898534" w:history="1">
@@ -4844,10 +4825,9 @@
         </w:tabs>
         <w:ind w:left="960"/>
         <w:rPr>
-          <w:rFonts w:asciiTheme="minorHAnsi" w:eastAsiaTheme="minorEastAsia" w:hAnsiTheme="minorHAnsi" w:cstheme="minorBidi" w:hint="eastAsia"/>
+          <w:rFonts w:ascii="等线" w:eastAsia="等线" w:hAnsi="等线" w:hint="eastAsia"/>
           <w:noProof/>
           <w:sz w:val="22"/>
-          <w14:ligatures w14:val="standardContextual"/>
         </w:rPr>
       </w:pPr>
       <w:hyperlink w:anchor="_Toc240898535" w:history="1">
@@ -4938,10 +4918,9 @@
         </w:tabs>
         <w:ind w:left="960"/>
         <w:rPr>
-          <w:rFonts w:asciiTheme="minorHAnsi" w:eastAsiaTheme="minorEastAsia" w:hAnsiTheme="minorHAnsi" w:cstheme="minorBidi" w:hint="eastAsia"/>
+          <w:rFonts w:ascii="等线" w:eastAsia="等线" w:hAnsi="等线" w:hint="eastAsia"/>
           <w:noProof/>
           <w:sz w:val="22"/>
-          <w14:ligatures w14:val="standardContextual"/>
         </w:rPr>
       </w:pPr>
       <w:hyperlink w:anchor="_Toc240898536" w:history="1">
@@ -5032,10 +5011,9 @@
         </w:tabs>
         <w:ind w:left="480"/>
         <w:rPr>
-          <w:rFonts w:asciiTheme="minorHAnsi" w:eastAsiaTheme="minorEastAsia" w:hAnsiTheme="minorHAnsi" w:cstheme="minorBidi" w:hint="eastAsia"/>
+          <w:rFonts w:ascii="等线" w:eastAsia="等线" w:hAnsi="等线" w:hint="eastAsia"/>
           <w:noProof/>
           <w:sz w:val="22"/>
-          <w14:ligatures w14:val="standardContextual"/>
         </w:rPr>
       </w:pPr>
       <w:hyperlink w:anchor="_Toc240898537" w:history="1">
@@ -5125,9 +5103,8 @@
           <w:tab w:val="right" w:leader="dot" w:pos="8290"/>
         </w:tabs>
         <w:rPr>
-          <w:rFonts w:asciiTheme="minorHAnsi" w:eastAsiaTheme="minorEastAsia" w:hAnsiTheme="minorHAnsi" w:cstheme="minorBidi" w:hint="eastAsia"/>
+          <w:rFonts w:ascii="等线" w:eastAsia="等线" w:hAnsi="等线" w:hint="eastAsia"/>
           <w:noProof/>
-          <w14:ligatures w14:val="standardContextual"/>
         </w:rPr>
       </w:pPr>
       <w:hyperlink w:anchor="_Toc240898538" w:history="1">
@@ -5218,10 +5195,9 @@
         </w:tabs>
         <w:ind w:left="480"/>
         <w:rPr>
-          <w:rFonts w:asciiTheme="minorHAnsi" w:eastAsiaTheme="minorEastAsia" w:hAnsiTheme="minorHAnsi" w:cstheme="minorBidi" w:hint="eastAsia"/>
+          <w:rFonts w:ascii="等线" w:eastAsia="等线" w:hAnsi="等线" w:hint="eastAsia"/>
           <w:noProof/>
           <w:sz w:val="22"/>
-          <w14:ligatures w14:val="standardContextual"/>
         </w:rPr>
       </w:pPr>
       <w:hyperlink w:anchor="_Toc240898539" w:history="1">
@@ -5312,10 +5288,9 @@
         </w:tabs>
         <w:ind w:left="480"/>
         <w:rPr>
-          <w:rFonts w:asciiTheme="minorHAnsi" w:eastAsiaTheme="minorEastAsia" w:hAnsiTheme="minorHAnsi" w:cstheme="minorBidi" w:hint="eastAsia"/>
+          <w:rFonts w:ascii="等线" w:eastAsia="等线" w:hAnsi="等线" w:hint="eastAsia"/>
           <w:noProof/>
           <w:sz w:val="22"/>
-          <w14:ligatures w14:val="standardContextual"/>
         </w:rPr>
       </w:pPr>
       <w:hyperlink w:anchor="_Toc240898540" w:history="1">
@@ -5406,10 +5381,9 @@
         </w:tabs>
         <w:ind w:left="480"/>
         <w:rPr>
-          <w:rFonts w:asciiTheme="minorHAnsi" w:eastAsiaTheme="minorEastAsia" w:hAnsiTheme="minorHAnsi" w:cstheme="minorBidi" w:hint="eastAsia"/>
+          <w:rFonts w:ascii="等线" w:eastAsia="等线" w:hAnsi="等线" w:hint="eastAsia"/>
           <w:noProof/>
           <w:sz w:val="22"/>
-          <w14:ligatures w14:val="standardContextual"/>
         </w:rPr>
       </w:pPr>
       <w:hyperlink w:anchor="_Toc240898541" w:history="1">
@@ -5500,10 +5474,9 @@
         </w:tabs>
         <w:ind w:left="480"/>
         <w:rPr>
-          <w:rFonts w:asciiTheme="minorHAnsi" w:eastAsiaTheme="minorEastAsia" w:hAnsiTheme="minorHAnsi" w:cstheme="minorBidi" w:hint="eastAsia"/>
+          <w:rFonts w:ascii="等线" w:eastAsia="等线" w:hAnsi="等线" w:hint="eastAsia"/>
           <w:noProof/>
           <w:sz w:val="22"/>
-          <w14:ligatures w14:val="standardContextual"/>
         </w:rPr>
       </w:pPr>
       <w:hyperlink w:anchor="_Toc240898542" w:history="1">
@@ -5594,10 +5567,9 @@
         </w:tabs>
         <w:ind w:left="480"/>
         <w:rPr>
-          <w:rFonts w:asciiTheme="minorHAnsi" w:eastAsiaTheme="minorEastAsia" w:hAnsiTheme="minorHAnsi" w:cstheme="minorBidi" w:hint="eastAsia"/>
+          <w:rFonts w:ascii="等线" w:eastAsia="等线" w:hAnsi="等线" w:hint="eastAsia"/>
           <w:noProof/>
           <w:sz w:val="22"/>
-          <w14:ligatures w14:val="standardContextual"/>
         </w:rPr>
       </w:pPr>
       <w:hyperlink w:anchor="_Toc240898543" w:history="1">
@@ -5687,9 +5659,8 @@
           <w:tab w:val="right" w:leader="dot" w:pos="8290"/>
         </w:tabs>
         <w:rPr>
-          <w:rFonts w:asciiTheme="minorHAnsi" w:eastAsiaTheme="minorEastAsia" w:hAnsiTheme="minorHAnsi" w:cstheme="minorBidi" w:hint="eastAsia"/>
+          <w:rFonts w:ascii="等线" w:eastAsia="等线" w:hAnsi="等线" w:hint="eastAsia"/>
           <w:noProof/>
-          <w14:ligatures w14:val="standardContextual"/>
         </w:rPr>
       </w:pPr>
       <w:hyperlink w:anchor="_Toc240898544" w:history="1">
@@ -5780,10 +5751,9 @@
         </w:tabs>
         <w:ind w:left="480"/>
         <w:rPr>
-          <w:rFonts w:asciiTheme="minorHAnsi" w:eastAsiaTheme="minorEastAsia" w:hAnsiTheme="minorHAnsi" w:cstheme="minorBidi" w:hint="eastAsia"/>
+          <w:rFonts w:ascii="等线" w:eastAsia="等线" w:hAnsi="等线" w:hint="eastAsia"/>
           <w:noProof/>
           <w:sz w:val="22"/>
-          <w14:ligatures w14:val="standardContextual"/>
         </w:rPr>
       </w:pPr>
       <w:hyperlink w:anchor="_Toc240898545" w:history="1">
@@ -5874,10 +5844,9 @@
         </w:tabs>
         <w:ind w:left="480"/>
         <w:rPr>
-          <w:rFonts w:asciiTheme="minorHAnsi" w:eastAsiaTheme="minorEastAsia" w:hAnsiTheme="minorHAnsi" w:cstheme="minorBidi" w:hint="eastAsia"/>
+          <w:rFonts w:ascii="等线" w:eastAsia="等线" w:hAnsi="等线" w:hint="eastAsia"/>
           <w:noProof/>
           <w:sz w:val="22"/>
-          <w14:ligatures w14:val="standardContextual"/>
         </w:rPr>
       </w:pPr>
       <w:hyperlink w:anchor="_Toc240898546" w:history="1">
@@ -5968,10 +5937,9 @@
         </w:tabs>
         <w:ind w:left="480"/>
         <w:rPr>
-          <w:rFonts w:asciiTheme="minorHAnsi" w:eastAsiaTheme="minorEastAsia" w:hAnsiTheme="minorHAnsi" w:cstheme="minorBidi" w:hint="eastAsia"/>
+          <w:rFonts w:ascii="等线" w:eastAsia="等线" w:hAnsi="等线" w:hint="eastAsia"/>
           <w:noProof/>
           <w:sz w:val="22"/>
-          <w14:ligatures w14:val="standardContextual"/>
         </w:rPr>
       </w:pPr>
       <w:hyperlink w:anchor="_Toc240898547" w:history="1">
@@ -6061,9 +6029,8 @@
           <w:tab w:val="right" w:leader="dot" w:pos="8290"/>
         </w:tabs>
         <w:rPr>
-          <w:rFonts w:asciiTheme="minorHAnsi" w:eastAsiaTheme="minorEastAsia" w:hAnsiTheme="minorHAnsi" w:cstheme="minorBidi" w:hint="eastAsia"/>
+          <w:rFonts w:ascii="等线" w:eastAsia="等线" w:hAnsi="等线" w:hint="eastAsia"/>
           <w:noProof/>
-          <w14:ligatures w14:val="standardContextual"/>
         </w:rPr>
       </w:pPr>
       <w:hyperlink w:anchor="_Toc240898548" w:history="1">
@@ -6154,10 +6121,9 @@
         </w:tabs>
         <w:ind w:left="480"/>
         <w:rPr>
-          <w:rFonts w:asciiTheme="minorHAnsi" w:eastAsiaTheme="minorEastAsia" w:hAnsiTheme="minorHAnsi" w:cstheme="minorBidi" w:hint="eastAsia"/>
+          <w:rFonts w:ascii="等线" w:eastAsia="等线" w:hAnsi="等线" w:hint="eastAsia"/>
           <w:noProof/>
           <w:sz w:val="22"/>
-          <w14:ligatures w14:val="standardContextual"/>
         </w:rPr>
       </w:pPr>
       <w:hyperlink w:anchor="_Toc240898549" w:history="1">
@@ -6248,10 +6214,9 @@
         </w:tabs>
         <w:ind w:left="480"/>
         <w:rPr>
-          <w:rFonts w:asciiTheme="minorHAnsi" w:eastAsiaTheme="minorEastAsia" w:hAnsiTheme="minorHAnsi" w:cstheme="minorBidi" w:hint="eastAsia"/>
+          <w:rFonts w:ascii="等线" w:eastAsia="等线" w:hAnsi="等线" w:hint="eastAsia"/>
           <w:noProof/>
           <w:sz w:val="22"/>
-          <w14:ligatures w14:val="standardContextual"/>
         </w:rPr>
       </w:pPr>
       <w:hyperlink w:anchor="_Toc240898550" w:history="1">
@@ -6342,10 +6307,9 @@
         </w:tabs>
         <w:ind w:left="480"/>
         <w:rPr>
-          <w:rFonts w:asciiTheme="minorHAnsi" w:eastAsiaTheme="minorEastAsia" w:hAnsiTheme="minorHAnsi" w:cstheme="minorBidi" w:hint="eastAsia"/>
+          <w:rFonts w:ascii="等线" w:eastAsia="等线" w:hAnsi="等线" w:hint="eastAsia"/>
           <w:noProof/>
           <w:sz w:val="22"/>
-          <w14:ligatures w14:val="standardContextual"/>
         </w:rPr>
       </w:pPr>
       <w:hyperlink w:anchor="_Toc240898551" w:history="1">
@@ -6436,10 +6400,9 @@
         </w:tabs>
         <w:ind w:left="480"/>
         <w:rPr>
-          <w:rFonts w:asciiTheme="minorHAnsi" w:eastAsiaTheme="minorEastAsia" w:hAnsiTheme="minorHAnsi" w:cstheme="minorBidi" w:hint="eastAsia"/>
+          <w:rFonts w:ascii="等线" w:eastAsia="等线" w:hAnsi="等线" w:hint="eastAsia"/>
           <w:noProof/>
           <w:sz w:val="22"/>
-          <w14:ligatures w14:val="standardContextual"/>
         </w:rPr>
       </w:pPr>
       <w:hyperlink w:anchor="_Toc240898552" w:history="1">
@@ -6530,10 +6493,9 @@
         </w:tabs>
         <w:ind w:left="480"/>
         <w:rPr>
-          <w:rFonts w:asciiTheme="minorHAnsi" w:eastAsiaTheme="minorEastAsia" w:hAnsiTheme="minorHAnsi" w:cstheme="minorBidi" w:hint="eastAsia"/>
+          <w:rFonts w:ascii="等线" w:eastAsia="等线" w:hAnsi="等线" w:hint="eastAsia"/>
           <w:noProof/>
           <w:sz w:val="22"/>
-          <w14:ligatures w14:val="standardContextual"/>
         </w:rPr>
       </w:pPr>
       <w:hyperlink w:anchor="_Toc240898553" w:history="1">
@@ -6623,9 +6585,8 @@
           <w:tab w:val="right" w:leader="dot" w:pos="8290"/>
         </w:tabs>
         <w:rPr>
-          <w:rFonts w:asciiTheme="minorHAnsi" w:eastAsiaTheme="minorEastAsia" w:hAnsiTheme="minorHAnsi" w:cstheme="minorBidi" w:hint="eastAsia"/>
+          <w:rFonts w:ascii="等线" w:eastAsia="等线" w:hAnsi="等线" w:hint="eastAsia"/>
           <w:noProof/>
-          <w14:ligatures w14:val="standardContextual"/>
         </w:rPr>
       </w:pPr>
       <w:hyperlink w:anchor="_Toc240898554" w:history="1">
@@ -6716,10 +6677,9 @@
         </w:tabs>
         <w:ind w:left="480"/>
         <w:rPr>
-          <w:rFonts w:asciiTheme="minorHAnsi" w:eastAsiaTheme="minorEastAsia" w:hAnsiTheme="minorHAnsi" w:cstheme="minorBidi" w:hint="eastAsia"/>
+          <w:rFonts w:ascii="等线" w:eastAsia="等线" w:hAnsi="等线" w:hint="eastAsia"/>
           <w:noProof/>
           <w:sz w:val="22"/>
-          <w14:ligatures w14:val="standardContextual"/>
         </w:rPr>
       </w:pPr>
       <w:hyperlink w:anchor="_Toc240898555" w:history="1">
@@ -6810,10 +6770,9 @@
         </w:tabs>
         <w:ind w:left="480"/>
         <w:rPr>
-          <w:rFonts w:asciiTheme="minorHAnsi" w:eastAsiaTheme="minorEastAsia" w:hAnsiTheme="minorHAnsi" w:cstheme="minorBidi" w:hint="eastAsia"/>
+          <w:rFonts w:ascii="等线" w:eastAsia="等线" w:hAnsi="等线" w:hint="eastAsia"/>
           <w:noProof/>
           <w:sz w:val="22"/>
-          <w14:ligatures w14:val="standardContextual"/>
         </w:rPr>
       </w:pPr>
       <w:hyperlink w:anchor="_Toc240898556" w:history="1">
@@ -6904,10 +6863,9 @@
         </w:tabs>
         <w:ind w:left="960"/>
         <w:rPr>
-          <w:rFonts w:asciiTheme="minorHAnsi" w:eastAsiaTheme="minorEastAsia" w:hAnsiTheme="minorHAnsi" w:cstheme="minorBidi" w:hint="eastAsia"/>
+          <w:rFonts w:ascii="等线" w:eastAsia="等线" w:hAnsi="等线" w:hint="eastAsia"/>
           <w:noProof/>
           <w:sz w:val="22"/>
-          <w14:ligatures w14:val="standardContextual"/>
         </w:rPr>
       </w:pPr>
       <w:hyperlink w:anchor="_Toc240898557" w:history="1">
@@ -6998,10 +6956,9 @@
         </w:tabs>
         <w:ind w:left="960"/>
         <w:rPr>
-          <w:rFonts w:asciiTheme="minorHAnsi" w:eastAsiaTheme="minorEastAsia" w:hAnsiTheme="minorHAnsi" w:cstheme="minorBidi" w:hint="eastAsia"/>
+          <w:rFonts w:ascii="等线" w:eastAsia="等线" w:hAnsi="等线" w:hint="eastAsia"/>
           <w:noProof/>
           <w:sz w:val="22"/>
-          <w14:ligatures w14:val="standardContextual"/>
         </w:rPr>
       </w:pPr>
       <w:hyperlink w:anchor="_Toc240898558" w:history="1">
@@ -7092,10 +7049,9 @@
         </w:tabs>
         <w:ind w:left="480"/>
         <w:rPr>
-          <w:rFonts w:asciiTheme="minorHAnsi" w:eastAsiaTheme="minorEastAsia" w:hAnsiTheme="minorHAnsi" w:cstheme="minorBidi" w:hint="eastAsia"/>
+          <w:rFonts w:ascii="等线" w:eastAsia="等线" w:hAnsi="等线" w:hint="eastAsia"/>
           <w:noProof/>
           <w:sz w:val="22"/>
-          <w14:ligatures w14:val="standardContextual"/>
         </w:rPr>
       </w:pPr>
       <w:hyperlink w:anchor="_Toc240898559" w:history="1">
@@ -7185,9 +7141,8 @@
           <w:tab w:val="right" w:leader="dot" w:pos="8290"/>
         </w:tabs>
         <w:rPr>
-          <w:rFonts w:asciiTheme="minorHAnsi" w:eastAsiaTheme="minorEastAsia" w:hAnsiTheme="minorHAnsi" w:cstheme="minorBidi" w:hint="eastAsia"/>
+          <w:rFonts w:ascii="等线" w:eastAsia="等线" w:hAnsi="等线" w:hint="eastAsia"/>
           <w:noProof/>
-          <w14:ligatures w14:val="standardContextual"/>
         </w:rPr>
       </w:pPr>
       <w:hyperlink w:anchor="_Toc240898560" w:history="1">
@@ -7277,9 +7232,8 @@
           <w:tab w:val="right" w:leader="dot" w:pos="8290"/>
         </w:tabs>
         <w:rPr>
-          <w:rFonts w:asciiTheme="minorHAnsi" w:eastAsiaTheme="minorEastAsia" w:hAnsiTheme="minorHAnsi" w:cstheme="minorBidi" w:hint="eastAsia"/>
+          <w:rFonts w:ascii="等线" w:eastAsia="等线" w:hAnsi="等线" w:hint="eastAsia"/>
           <w:noProof/>
-          <w14:ligatures w14:val="standardContextual"/>
         </w:rPr>
       </w:pPr>
       <w:hyperlink w:anchor="_Toc240898561" w:history="1">
@@ -7370,10 +7324,9 @@
         </w:tabs>
         <w:ind w:left="480"/>
         <w:rPr>
-          <w:rFonts w:asciiTheme="minorHAnsi" w:eastAsiaTheme="minorEastAsia" w:hAnsiTheme="minorHAnsi" w:cstheme="minorBidi" w:hint="eastAsia"/>
+          <w:rFonts w:ascii="等线" w:eastAsia="等线" w:hAnsi="等线" w:hint="eastAsia"/>
           <w:noProof/>
           <w:sz w:val="22"/>
-          <w14:ligatures w14:val="standardContextual"/>
         </w:rPr>
       </w:pPr>
       <w:hyperlink w:anchor="_Toc240898562" w:history="1">
@@ -7464,10 +7417,9 @@
         </w:tabs>
         <w:ind w:left="480"/>
         <w:rPr>
-          <w:rFonts w:asciiTheme="minorHAnsi" w:eastAsiaTheme="minorEastAsia" w:hAnsiTheme="minorHAnsi" w:cstheme="minorBidi" w:hint="eastAsia"/>
+          <w:rFonts w:ascii="等线" w:eastAsia="等线" w:hAnsi="等线" w:hint="eastAsia"/>
           <w:noProof/>
           <w:sz w:val="22"/>
-          <w14:ligatures w14:val="standardContextual"/>
         </w:rPr>
       </w:pPr>
       <w:hyperlink w:anchor="_Toc240898563" w:history="1">
@@ -7557,9 +7509,8 @@
           <w:tab w:val="right" w:leader="dot" w:pos="8290"/>
         </w:tabs>
         <w:rPr>
-          <w:rFonts w:asciiTheme="minorHAnsi" w:eastAsiaTheme="minorEastAsia" w:hAnsiTheme="minorHAnsi" w:cstheme="minorBidi" w:hint="eastAsia"/>
+          <w:rFonts w:ascii="等线" w:eastAsia="等线" w:hAnsi="等线" w:hint="eastAsia"/>
           <w:noProof/>
-          <w14:ligatures w14:val="standardContextual"/>
         </w:rPr>
       </w:pPr>
       <w:hyperlink w:anchor="_Toc240898564" w:history="1">
@@ -7650,10 +7601,9 @@
         </w:tabs>
         <w:ind w:left="480"/>
         <w:rPr>
-          <w:rFonts w:asciiTheme="minorHAnsi" w:eastAsiaTheme="minorEastAsia" w:hAnsiTheme="minorHAnsi" w:cstheme="minorBidi" w:hint="eastAsia"/>
+          <w:rFonts w:ascii="等线" w:eastAsia="等线" w:hAnsi="等线" w:hint="eastAsia"/>
           <w:noProof/>
           <w:sz w:val="22"/>
-          <w14:ligatures w14:val="standardContextual"/>
         </w:rPr>
       </w:pPr>
       <w:hyperlink w:anchor="_Toc240898565" w:history="1">
@@ -7744,10 +7694,9 @@
         </w:tabs>
         <w:ind w:left="480"/>
         <w:rPr>
-          <w:rFonts w:asciiTheme="minorHAnsi" w:eastAsiaTheme="minorEastAsia" w:hAnsiTheme="minorHAnsi" w:cstheme="minorBidi" w:hint="eastAsia"/>
+          <w:rFonts w:ascii="等线" w:eastAsia="等线" w:hAnsi="等线" w:hint="eastAsia"/>
           <w:noProof/>
           <w:sz w:val="22"/>
-          <w14:ligatures w14:val="standardContextual"/>
         </w:rPr>
       </w:pPr>
       <w:hyperlink w:anchor="_Toc240898566" w:history="1">
@@ -7838,10 +7787,9 @@
         </w:tabs>
         <w:ind w:left="480"/>
         <w:rPr>
-          <w:rFonts w:asciiTheme="minorHAnsi" w:eastAsiaTheme="minorEastAsia" w:hAnsiTheme="minorHAnsi" w:cstheme="minorBidi" w:hint="eastAsia"/>
+          <w:rFonts w:ascii="等线" w:eastAsia="等线" w:hAnsi="等线" w:hint="eastAsia"/>
           <w:noProof/>
           <w:sz w:val="22"/>
-          <w14:ligatures w14:val="standardContextual"/>
         </w:rPr>
       </w:pPr>
       <w:hyperlink w:anchor="_Toc240898567" w:history="1">
@@ -7932,10 +7880,9 @@
         </w:tabs>
         <w:ind w:left="480"/>
         <w:rPr>
-          <w:rFonts w:asciiTheme="minorHAnsi" w:eastAsiaTheme="minorEastAsia" w:hAnsiTheme="minorHAnsi" w:cstheme="minorBidi" w:hint="eastAsia"/>
+          <w:rFonts w:ascii="等线" w:eastAsia="等线" w:hAnsi="等线" w:hint="eastAsia"/>
           <w:noProof/>
           <w:sz w:val="22"/>
-          <w14:ligatures w14:val="standardContextual"/>
         </w:rPr>
       </w:pPr>
       <w:hyperlink w:anchor="_Toc240898568" w:history="1">
@@ -8149,9 +8096,16 @@
     </w:p>
     <w:tbl>
       <w:tblPr>
-        <w:tblStyle w:val="a9"/>
         <w:tblW w:w="0" w:type="auto"/>
         <w:jc w:val="center"/>
+        <w:tblBorders>
+          <w:top w:val="single" w:sz="4" w:space="0" w:color="auto"/>
+          <w:left w:val="single" w:sz="4" w:space="0" w:color="auto"/>
+          <w:bottom w:val="single" w:sz="4" w:space="0" w:color="auto"/>
+          <w:right w:val="single" w:sz="4" w:space="0" w:color="auto"/>
+          <w:insideH w:val="single" w:sz="4" w:space="0" w:color="auto"/>
+          <w:insideV w:val="single" w:sz="4" w:space="0" w:color="auto"/>
+        </w:tblBorders>
         <w:tblLayout w:type="fixed"/>
         <w:tblLook w:val="04A0" w:firstRow="1" w:lastRow="0" w:firstColumn="1" w:lastColumn="0" w:noHBand="0" w:noVBand="1"/>
       </w:tblPr>
@@ -8812,9 +8766,16 @@
     </w:p>
     <w:tbl>
       <w:tblPr>
-        <w:tblStyle w:val="a9"/>
         <w:tblW w:w="0" w:type="auto"/>
         <w:jc w:val="center"/>
+        <w:tblBorders>
+          <w:top w:val="single" w:sz="4" w:space="0" w:color="auto"/>
+          <w:left w:val="single" w:sz="4" w:space="0" w:color="auto"/>
+          <w:bottom w:val="single" w:sz="4" w:space="0" w:color="auto"/>
+          <w:right w:val="single" w:sz="4" w:space="0" w:color="auto"/>
+          <w:insideH w:val="single" w:sz="4" w:space="0" w:color="auto"/>
+          <w:insideV w:val="single" w:sz="4" w:space="0" w:color="auto"/>
+        </w:tblBorders>
         <w:tblLayout w:type="fixed"/>
         <w:tblLook w:val="04A0" w:firstRow="1" w:lastRow="0" w:firstColumn="1" w:lastColumn="0" w:noHBand="0" w:noVBand="1"/>
       </w:tblPr>
@@ -9393,9 +9354,16 @@
     </w:p>
     <w:tbl>
       <w:tblPr>
-        <w:tblStyle w:val="a9"/>
         <w:tblW w:w="0" w:type="auto"/>
         <w:jc w:val="center"/>
+        <w:tblBorders>
+          <w:top w:val="single" w:sz="4" w:space="0" w:color="auto"/>
+          <w:left w:val="single" w:sz="4" w:space="0" w:color="auto"/>
+          <w:bottom w:val="single" w:sz="4" w:space="0" w:color="auto"/>
+          <w:right w:val="single" w:sz="4" w:space="0" w:color="auto"/>
+          <w:insideH w:val="single" w:sz="4" w:space="0" w:color="auto"/>
+          <w:insideV w:val="single" w:sz="4" w:space="0" w:color="auto"/>
+        </w:tblBorders>
         <w:tblLayout w:type="fixed"/>
         <w:tblLook w:val="04A0" w:firstRow="1" w:lastRow="0" w:firstColumn="1" w:lastColumn="0" w:noHBand="0" w:noVBand="1"/>
       </w:tblPr>
@@ -10145,9 +10113,16 @@
     </w:p>
     <w:tbl>
       <w:tblPr>
-        <w:tblStyle w:val="a9"/>
         <w:tblW w:w="0" w:type="auto"/>
         <w:jc w:val="center"/>
+        <w:tblBorders>
+          <w:top w:val="single" w:sz="4" w:space="0" w:color="auto"/>
+          <w:left w:val="single" w:sz="4" w:space="0" w:color="auto"/>
+          <w:bottom w:val="single" w:sz="4" w:space="0" w:color="auto"/>
+          <w:right w:val="single" w:sz="4" w:space="0" w:color="auto"/>
+          <w:insideH w:val="single" w:sz="4" w:space="0" w:color="auto"/>
+          <w:insideV w:val="single" w:sz="4" w:space="0" w:color="auto"/>
+        </w:tblBorders>
         <w:tblLayout w:type="fixed"/>
         <w:tblLook w:val="04A0" w:firstRow="1" w:lastRow="0" w:firstColumn="1" w:lastColumn="0" w:noHBand="0" w:noVBand="1"/>
       </w:tblPr>
@@ -15215,9 +15190,16 @@
     </w:p>
     <w:tbl>
       <w:tblPr>
-        <w:tblStyle w:val="a9"/>
         <w:tblW w:w="0" w:type="auto"/>
         <w:jc w:val="center"/>
+        <w:tblBorders>
+          <w:top w:val="single" w:sz="4" w:space="0" w:color="auto"/>
+          <w:left w:val="single" w:sz="4" w:space="0" w:color="auto"/>
+          <w:bottom w:val="single" w:sz="4" w:space="0" w:color="auto"/>
+          <w:right w:val="single" w:sz="4" w:space="0" w:color="auto"/>
+          <w:insideH w:val="single" w:sz="4" w:space="0" w:color="auto"/>
+          <w:insideV w:val="single" w:sz="4" w:space="0" w:color="auto"/>
+        </w:tblBorders>
         <w:tblLayout w:type="fixed"/>
         <w:tblLook w:val="04A0" w:firstRow="1" w:lastRow="0" w:firstColumn="1" w:lastColumn="0" w:noHBand="0" w:noVBand="1"/>
       </w:tblPr>
@@ -15791,9 +15773,16 @@
     </w:p>
     <w:tbl>
       <w:tblPr>
-        <w:tblStyle w:val="a9"/>
         <w:tblW w:w="0" w:type="auto"/>
         <w:jc w:val="center"/>
+        <w:tblBorders>
+          <w:top w:val="single" w:sz="4" w:space="0" w:color="auto"/>
+          <w:left w:val="single" w:sz="4" w:space="0" w:color="auto"/>
+          <w:bottom w:val="single" w:sz="4" w:space="0" w:color="auto"/>
+          <w:right w:val="single" w:sz="4" w:space="0" w:color="auto"/>
+          <w:insideH w:val="single" w:sz="4" w:space="0" w:color="auto"/>
+          <w:insideV w:val="single" w:sz="4" w:space="0" w:color="auto"/>
+        </w:tblBorders>
         <w:tblLayout w:type="fixed"/>
         <w:tblLook w:val="04A0" w:firstRow="1" w:lastRow="0" w:firstColumn="1" w:lastColumn="0" w:noHBand="0" w:noVBand="1"/>
       </w:tblPr>
@@ -16366,9 +16355,16 @@
     </w:p>
     <w:tbl>
       <w:tblPr>
-        <w:tblStyle w:val="a9"/>
         <w:tblW w:w="0" w:type="auto"/>
         <w:jc w:val="center"/>
+        <w:tblBorders>
+          <w:top w:val="single" w:sz="4" w:space="0" w:color="auto"/>
+          <w:left w:val="single" w:sz="4" w:space="0" w:color="auto"/>
+          <w:bottom w:val="single" w:sz="4" w:space="0" w:color="auto"/>
+          <w:right w:val="single" w:sz="4" w:space="0" w:color="auto"/>
+          <w:insideH w:val="single" w:sz="4" w:space="0" w:color="auto"/>
+          <w:insideV w:val="single" w:sz="4" w:space="0" w:color="auto"/>
+        </w:tblBorders>
         <w:tblLayout w:type="fixed"/>
         <w:tblLook w:val="04A0" w:firstRow="1" w:lastRow="0" w:firstColumn="1" w:lastColumn="0" w:noHBand="0" w:noVBand="1"/>
       </w:tblPr>
@@ -16927,9 +16923,16 @@
     </w:p>
     <w:tbl>
       <w:tblPr>
-        <w:tblStyle w:val="a9"/>
         <w:tblW w:w="0" w:type="auto"/>
         <w:jc w:val="center"/>
+        <w:tblBorders>
+          <w:top w:val="single" w:sz="4" w:space="0" w:color="auto"/>
+          <w:left w:val="single" w:sz="4" w:space="0" w:color="auto"/>
+          <w:bottom w:val="single" w:sz="4" w:space="0" w:color="auto"/>
+          <w:right w:val="single" w:sz="4" w:space="0" w:color="auto"/>
+          <w:insideH w:val="single" w:sz="4" w:space="0" w:color="auto"/>
+          <w:insideV w:val="single" w:sz="4" w:space="0" w:color="auto"/>
+        </w:tblBorders>
         <w:tblLayout w:type="fixed"/>
         <w:tblLook w:val="04A0" w:firstRow="1" w:lastRow="0" w:firstColumn="1" w:lastColumn="0" w:noHBand="0" w:noVBand="1"/>
       </w:tblPr>
@@ -17512,9 +17515,16 @@
     </w:p>
     <w:tbl>
       <w:tblPr>
-        <w:tblStyle w:val="a9"/>
         <w:tblW w:w="0" w:type="auto"/>
         <w:jc w:val="center"/>
+        <w:tblBorders>
+          <w:top w:val="single" w:sz="4" w:space="0" w:color="auto"/>
+          <w:left w:val="single" w:sz="4" w:space="0" w:color="auto"/>
+          <w:bottom w:val="single" w:sz="4" w:space="0" w:color="auto"/>
+          <w:right w:val="single" w:sz="4" w:space="0" w:color="auto"/>
+          <w:insideH w:val="single" w:sz="4" w:space="0" w:color="auto"/>
+          <w:insideV w:val="single" w:sz="4" w:space="0" w:color="auto"/>
+        </w:tblBorders>
         <w:tblLayout w:type="fixed"/>
         <w:tblLook w:val="04A0" w:firstRow="1" w:lastRow="0" w:firstColumn="1" w:lastColumn="0" w:noHBand="0" w:noVBand="1"/>
       </w:tblPr>
@@ -18072,9 +18082,16 @@
     </w:p>
     <w:tbl>
       <w:tblPr>
-        <w:tblStyle w:val="a9"/>
         <w:tblW w:w="0" w:type="auto"/>
         <w:jc w:val="center"/>
+        <w:tblBorders>
+          <w:top w:val="single" w:sz="4" w:space="0" w:color="auto"/>
+          <w:left w:val="single" w:sz="4" w:space="0" w:color="auto"/>
+          <w:bottom w:val="single" w:sz="4" w:space="0" w:color="auto"/>
+          <w:right w:val="single" w:sz="4" w:space="0" w:color="auto"/>
+          <w:insideH w:val="single" w:sz="4" w:space="0" w:color="auto"/>
+          <w:insideV w:val="single" w:sz="4" w:space="0" w:color="auto"/>
+        </w:tblBorders>
         <w:tblLayout w:type="fixed"/>
         <w:tblLook w:val="04A0" w:firstRow="1" w:lastRow="0" w:firstColumn="1" w:lastColumn="0" w:noHBand="0" w:noVBand="1"/>
       </w:tblPr>
@@ -18633,9 +18650,16 @@
     </w:p>
     <w:tbl>
       <w:tblPr>
-        <w:tblStyle w:val="a9"/>
         <w:tblW w:w="0" w:type="auto"/>
         <w:jc w:val="center"/>
+        <w:tblBorders>
+          <w:top w:val="single" w:sz="4" w:space="0" w:color="auto"/>
+          <w:left w:val="single" w:sz="4" w:space="0" w:color="auto"/>
+          <w:bottom w:val="single" w:sz="4" w:space="0" w:color="auto"/>
+          <w:right w:val="single" w:sz="4" w:space="0" w:color="auto"/>
+          <w:insideH w:val="single" w:sz="4" w:space="0" w:color="auto"/>
+          <w:insideV w:val="single" w:sz="4" w:space="0" w:color="auto"/>
+        </w:tblBorders>
         <w:tblLayout w:type="fixed"/>
         <w:tblLook w:val="04A0" w:firstRow="1" w:lastRow="0" w:firstColumn="1" w:lastColumn="0" w:noHBand="0" w:noVBand="1"/>
       </w:tblPr>
@@ -19193,9 +19217,16 @@
     </w:p>
     <w:tbl>
       <w:tblPr>
-        <w:tblStyle w:val="a9"/>
         <w:tblW w:w="0" w:type="auto"/>
         <w:jc w:val="center"/>
+        <w:tblBorders>
+          <w:top w:val="single" w:sz="4" w:space="0" w:color="auto"/>
+          <w:left w:val="single" w:sz="4" w:space="0" w:color="auto"/>
+          <w:bottom w:val="single" w:sz="4" w:space="0" w:color="auto"/>
+          <w:right w:val="single" w:sz="4" w:space="0" w:color="auto"/>
+          <w:insideH w:val="single" w:sz="4" w:space="0" w:color="auto"/>
+          <w:insideV w:val="single" w:sz="4" w:space="0" w:color="auto"/>
+        </w:tblBorders>
         <w:tblLayout w:type="fixed"/>
         <w:tblLook w:val="04A0" w:firstRow="1" w:lastRow="0" w:firstColumn="1" w:lastColumn="0" w:noHBand="0" w:noVBand="1"/>
       </w:tblPr>
@@ -19754,9 +19785,16 @@
     </w:p>
     <w:tbl>
       <w:tblPr>
-        <w:tblStyle w:val="a9"/>
         <w:tblW w:w="0" w:type="auto"/>
         <w:jc w:val="center"/>
+        <w:tblBorders>
+          <w:top w:val="single" w:sz="4" w:space="0" w:color="auto"/>
+          <w:left w:val="single" w:sz="4" w:space="0" w:color="auto"/>
+          <w:bottom w:val="single" w:sz="4" w:space="0" w:color="auto"/>
+          <w:right w:val="single" w:sz="4" w:space="0" w:color="auto"/>
+          <w:insideH w:val="single" w:sz="4" w:space="0" w:color="auto"/>
+          <w:insideV w:val="single" w:sz="4" w:space="0" w:color="auto"/>
+        </w:tblBorders>
         <w:tblLayout w:type="fixed"/>
         <w:tblLook w:val="04A0" w:firstRow="1" w:lastRow="0" w:firstColumn="1" w:lastColumn="0" w:noHBand="0" w:noVBand="1"/>
       </w:tblPr>
@@ -20285,9 +20323,16 @@
     </w:p>
     <w:tbl>
       <w:tblPr>
-        <w:tblStyle w:val="a9"/>
         <w:tblW w:w="0" w:type="auto"/>
         <w:jc w:val="center"/>
+        <w:tblBorders>
+          <w:top w:val="single" w:sz="4" w:space="0" w:color="auto"/>
+          <w:left w:val="single" w:sz="4" w:space="0" w:color="auto"/>
+          <w:bottom w:val="single" w:sz="4" w:space="0" w:color="auto"/>
+          <w:right w:val="single" w:sz="4" w:space="0" w:color="auto"/>
+          <w:insideH w:val="single" w:sz="4" w:space="0" w:color="auto"/>
+          <w:insideV w:val="single" w:sz="4" w:space="0" w:color="auto"/>
+        </w:tblBorders>
         <w:tblLayout w:type="fixed"/>
         <w:tblLook w:val="04A0" w:firstRow="1" w:lastRow="0" w:firstColumn="1" w:lastColumn="0" w:noHBand="0" w:noVBand="1"/>
       </w:tblPr>
@@ -20845,9 +20890,16 @@
     </w:p>
     <w:tbl>
       <w:tblPr>
-        <w:tblStyle w:val="a9"/>
         <w:tblW w:w="0" w:type="auto"/>
         <w:jc w:val="center"/>
+        <w:tblBorders>
+          <w:top w:val="single" w:sz="4" w:space="0" w:color="auto"/>
+          <w:left w:val="single" w:sz="4" w:space="0" w:color="auto"/>
+          <w:bottom w:val="single" w:sz="4" w:space="0" w:color="auto"/>
+          <w:right w:val="single" w:sz="4" w:space="0" w:color="auto"/>
+          <w:insideH w:val="single" w:sz="4" w:space="0" w:color="auto"/>
+          <w:insideV w:val="single" w:sz="4" w:space="0" w:color="auto"/>
+        </w:tblBorders>
         <w:tblLayout w:type="fixed"/>
         <w:tblLook w:val="04A0" w:firstRow="1" w:lastRow="0" w:firstColumn="1" w:lastColumn="0" w:noHBand="0" w:noVBand="1"/>
       </w:tblPr>
@@ -21406,9 +21458,16 @@
     </w:p>
     <w:tbl>
       <w:tblPr>
-        <w:tblStyle w:val="a9"/>
         <w:tblW w:w="0" w:type="auto"/>
         <w:jc w:val="center"/>
+        <w:tblBorders>
+          <w:top w:val="single" w:sz="4" w:space="0" w:color="auto"/>
+          <w:left w:val="single" w:sz="4" w:space="0" w:color="auto"/>
+          <w:bottom w:val="single" w:sz="4" w:space="0" w:color="auto"/>
+          <w:right w:val="single" w:sz="4" w:space="0" w:color="auto"/>
+          <w:insideH w:val="single" w:sz="4" w:space="0" w:color="auto"/>
+          <w:insideV w:val="single" w:sz="4" w:space="0" w:color="auto"/>
+        </w:tblBorders>
         <w:tblLayout w:type="fixed"/>
         <w:tblLook w:val="04A0" w:firstRow="1" w:lastRow="0" w:firstColumn="1" w:lastColumn="0" w:noHBand="0" w:noVBand="1"/>
       </w:tblPr>
@@ -21991,9 +22050,16 @@
     </w:p>
     <w:tbl>
       <w:tblPr>
-        <w:tblStyle w:val="a9"/>
         <w:tblW w:w="0" w:type="auto"/>
         <w:jc w:val="center"/>
+        <w:tblBorders>
+          <w:top w:val="single" w:sz="4" w:space="0" w:color="auto"/>
+          <w:left w:val="single" w:sz="4" w:space="0" w:color="auto"/>
+          <w:bottom w:val="single" w:sz="4" w:space="0" w:color="auto"/>
+          <w:right w:val="single" w:sz="4" w:space="0" w:color="auto"/>
+          <w:insideH w:val="single" w:sz="4" w:space="0" w:color="auto"/>
+          <w:insideV w:val="single" w:sz="4" w:space="0" w:color="auto"/>
+        </w:tblBorders>
         <w:tblLayout w:type="fixed"/>
         <w:tblLook w:val="04A0" w:firstRow="1" w:lastRow="0" w:firstColumn="1" w:lastColumn="0" w:noHBand="0" w:noVBand="1"/>
       </w:tblPr>
@@ -22521,9 +22587,16 @@
     </w:p>
     <w:tbl>
       <w:tblPr>
-        <w:tblStyle w:val="a9"/>
         <w:tblW w:w="0" w:type="auto"/>
         <w:jc w:val="center"/>
+        <w:tblBorders>
+          <w:top w:val="single" w:sz="4" w:space="0" w:color="auto"/>
+          <w:left w:val="single" w:sz="4" w:space="0" w:color="auto"/>
+          <w:bottom w:val="single" w:sz="4" w:space="0" w:color="auto"/>
+          <w:right w:val="single" w:sz="4" w:space="0" w:color="auto"/>
+          <w:insideH w:val="single" w:sz="4" w:space="0" w:color="auto"/>
+          <w:insideV w:val="single" w:sz="4" w:space="0" w:color="auto"/>
+        </w:tblBorders>
         <w:tblLayout w:type="fixed"/>
         <w:tblLook w:val="04A0" w:firstRow="1" w:lastRow="0" w:firstColumn="1" w:lastColumn="0" w:noHBand="0" w:noVBand="1"/>
       </w:tblPr>
@@ -23082,9 +23155,16 @@
     </w:p>
     <w:tbl>
       <w:tblPr>
-        <w:tblStyle w:val="a9"/>
         <w:tblW w:w="0" w:type="auto"/>
         <w:jc w:val="center"/>
+        <w:tblBorders>
+          <w:top w:val="single" w:sz="4" w:space="0" w:color="auto"/>
+          <w:left w:val="single" w:sz="4" w:space="0" w:color="auto"/>
+          <w:bottom w:val="single" w:sz="4" w:space="0" w:color="auto"/>
+          <w:right w:val="single" w:sz="4" w:space="0" w:color="auto"/>
+          <w:insideH w:val="single" w:sz="4" w:space="0" w:color="auto"/>
+          <w:insideV w:val="single" w:sz="4" w:space="0" w:color="auto"/>
+        </w:tblBorders>
         <w:tblLayout w:type="fixed"/>
         <w:tblLook w:val="04A0" w:firstRow="1" w:lastRow="0" w:firstColumn="1" w:lastColumn="0" w:noHBand="0" w:noVBand="1"/>
       </w:tblPr>
@@ -23667,9 +23747,16 @@
     </w:p>
     <w:tbl>
       <w:tblPr>
-        <w:tblStyle w:val="a9"/>
         <w:tblW w:w="0" w:type="auto"/>
         <w:jc w:val="center"/>
+        <w:tblBorders>
+          <w:top w:val="single" w:sz="4" w:space="0" w:color="auto"/>
+          <w:left w:val="single" w:sz="4" w:space="0" w:color="auto"/>
+          <w:bottom w:val="single" w:sz="4" w:space="0" w:color="auto"/>
+          <w:right w:val="single" w:sz="4" w:space="0" w:color="auto"/>
+          <w:insideH w:val="single" w:sz="4" w:space="0" w:color="auto"/>
+          <w:insideV w:val="single" w:sz="4" w:space="0" w:color="auto"/>
+        </w:tblBorders>
         <w:tblLayout w:type="fixed"/>
         <w:tblLook w:val="04A0" w:firstRow="1" w:lastRow="0" w:firstColumn="1" w:lastColumn="0" w:noHBand="0" w:noVBand="1"/>
       </w:tblPr>
@@ -24227,9 +24314,16 @@
     </w:p>
     <w:tbl>
       <w:tblPr>
-        <w:tblStyle w:val="a9"/>
         <w:tblW w:w="0" w:type="auto"/>
         <w:jc w:val="center"/>
+        <w:tblBorders>
+          <w:top w:val="single" w:sz="4" w:space="0" w:color="auto"/>
+          <w:left w:val="single" w:sz="4" w:space="0" w:color="auto"/>
+          <w:bottom w:val="single" w:sz="4" w:space="0" w:color="auto"/>
+          <w:right w:val="single" w:sz="4" w:space="0" w:color="auto"/>
+          <w:insideH w:val="single" w:sz="4" w:space="0" w:color="auto"/>
+          <w:insideV w:val="single" w:sz="4" w:space="0" w:color="auto"/>
+        </w:tblBorders>
         <w:tblLayout w:type="fixed"/>
         <w:tblLook w:val="04A0" w:firstRow="1" w:lastRow="0" w:firstColumn="1" w:lastColumn="0" w:noHBand="0" w:noVBand="1"/>
       </w:tblPr>
@@ -24788,9 +24882,16 @@
     </w:p>
     <w:tbl>
       <w:tblPr>
-        <w:tblStyle w:val="a9"/>
         <w:tblW w:w="0" w:type="auto"/>
         <w:jc w:val="center"/>
+        <w:tblBorders>
+          <w:top w:val="single" w:sz="4" w:space="0" w:color="auto"/>
+          <w:left w:val="single" w:sz="4" w:space="0" w:color="auto"/>
+          <w:bottom w:val="single" w:sz="4" w:space="0" w:color="auto"/>
+          <w:right w:val="single" w:sz="4" w:space="0" w:color="auto"/>
+          <w:insideH w:val="single" w:sz="4" w:space="0" w:color="auto"/>
+          <w:insideV w:val="single" w:sz="4" w:space="0" w:color="auto"/>
+        </w:tblBorders>
         <w:tblLayout w:type="fixed"/>
         <w:tblLook w:val="04A0" w:firstRow="1" w:lastRow="0" w:firstColumn="1" w:lastColumn="0" w:noHBand="0" w:noVBand="1"/>
       </w:tblPr>
@@ -25333,9 +25434,16 @@
     </w:p>
     <w:tbl>
       <w:tblPr>
-        <w:tblStyle w:val="a9"/>
         <w:tblW w:w="0" w:type="auto"/>
         <w:jc w:val="center"/>
+        <w:tblBorders>
+          <w:top w:val="single" w:sz="4" w:space="0" w:color="auto"/>
+          <w:left w:val="single" w:sz="4" w:space="0" w:color="auto"/>
+          <w:bottom w:val="single" w:sz="4" w:space="0" w:color="auto"/>
+          <w:right w:val="single" w:sz="4" w:space="0" w:color="auto"/>
+          <w:insideH w:val="single" w:sz="4" w:space="0" w:color="auto"/>
+          <w:insideV w:val="single" w:sz="4" w:space="0" w:color="auto"/>
+        </w:tblBorders>
         <w:tblLayout w:type="fixed"/>
         <w:tblLook w:val="04A0" w:firstRow="1" w:lastRow="0" w:firstColumn="1" w:lastColumn="0" w:noHBand="0" w:noVBand="1"/>
       </w:tblPr>
@@ -25894,9 +26002,16 @@
     </w:p>
     <w:tbl>
       <w:tblPr>
-        <w:tblStyle w:val="a9"/>
         <w:tblW w:w="0" w:type="auto"/>
         <w:jc w:val="center"/>
+        <w:tblBorders>
+          <w:top w:val="single" w:sz="4" w:space="0" w:color="auto"/>
+          <w:left w:val="single" w:sz="4" w:space="0" w:color="auto"/>
+          <w:bottom w:val="single" w:sz="4" w:space="0" w:color="auto"/>
+          <w:right w:val="single" w:sz="4" w:space="0" w:color="auto"/>
+          <w:insideH w:val="single" w:sz="4" w:space="0" w:color="auto"/>
+          <w:insideV w:val="single" w:sz="4" w:space="0" w:color="auto"/>
+        </w:tblBorders>
         <w:tblLayout w:type="fixed"/>
         <w:tblLook w:val="04A0" w:firstRow="1" w:lastRow="0" w:firstColumn="1" w:lastColumn="0" w:noHBand="0" w:noVBand="1"/>
       </w:tblPr>
@@ -26455,9 +26570,16 @@
     </w:p>
     <w:tbl>
       <w:tblPr>
-        <w:tblStyle w:val="a9"/>
         <w:tblW w:w="0" w:type="auto"/>
         <w:jc w:val="center"/>
+        <w:tblBorders>
+          <w:top w:val="single" w:sz="4" w:space="0" w:color="auto"/>
+          <w:left w:val="single" w:sz="4" w:space="0" w:color="auto"/>
+          <w:bottom w:val="single" w:sz="4" w:space="0" w:color="auto"/>
+          <w:right w:val="single" w:sz="4" w:space="0" w:color="auto"/>
+          <w:insideH w:val="single" w:sz="4" w:space="0" w:color="auto"/>
+          <w:insideV w:val="single" w:sz="4" w:space="0" w:color="auto"/>
+        </w:tblBorders>
         <w:tblLayout w:type="fixed"/>
         <w:tblLook w:val="04A0" w:firstRow="1" w:lastRow="0" w:firstColumn="1" w:lastColumn="0" w:noHBand="0" w:noVBand="1"/>
       </w:tblPr>
@@ -27000,9 +27122,16 @@
     </w:p>
     <w:tbl>
       <w:tblPr>
-        <w:tblStyle w:val="a9"/>
         <w:tblW w:w="0" w:type="auto"/>
         <w:jc w:val="center"/>
+        <w:tblBorders>
+          <w:top w:val="single" w:sz="4" w:space="0" w:color="auto"/>
+          <w:left w:val="single" w:sz="4" w:space="0" w:color="auto"/>
+          <w:bottom w:val="single" w:sz="4" w:space="0" w:color="auto"/>
+          <w:right w:val="single" w:sz="4" w:space="0" w:color="auto"/>
+          <w:insideH w:val="single" w:sz="4" w:space="0" w:color="auto"/>
+          <w:insideV w:val="single" w:sz="4" w:space="0" w:color="auto"/>
+        </w:tblBorders>
         <w:tblLayout w:type="fixed"/>
         <w:tblLook w:val="04A0" w:firstRow="1" w:lastRow="0" w:firstColumn="1" w:lastColumn="0" w:noHBand="0" w:noVBand="1"/>
       </w:tblPr>
@@ -27561,9 +27690,16 @@
     </w:p>
     <w:tbl>
       <w:tblPr>
-        <w:tblStyle w:val="a9"/>
         <w:tblW w:w="0" w:type="auto"/>
         <w:jc w:val="center"/>
+        <w:tblBorders>
+          <w:top w:val="single" w:sz="4" w:space="0" w:color="auto"/>
+          <w:left w:val="single" w:sz="4" w:space="0" w:color="auto"/>
+          <w:bottom w:val="single" w:sz="4" w:space="0" w:color="auto"/>
+          <w:right w:val="single" w:sz="4" w:space="0" w:color="auto"/>
+          <w:insideH w:val="single" w:sz="4" w:space="0" w:color="auto"/>
+          <w:insideV w:val="single" w:sz="4" w:space="0" w:color="auto"/>
+        </w:tblBorders>
         <w:tblLayout w:type="fixed"/>
         <w:tblLook w:val="04A0" w:firstRow="1" w:lastRow="0" w:firstColumn="1" w:lastColumn="0" w:noHBand="0" w:noVBand="1"/>
       </w:tblPr>
@@ -28106,9 +28242,16 @@
     </w:p>
     <w:tbl>
       <w:tblPr>
-        <w:tblStyle w:val="a9"/>
         <w:tblW w:w="0" w:type="auto"/>
         <w:jc w:val="center"/>
+        <w:tblBorders>
+          <w:top w:val="single" w:sz="4" w:space="0" w:color="auto"/>
+          <w:left w:val="single" w:sz="4" w:space="0" w:color="auto"/>
+          <w:bottom w:val="single" w:sz="4" w:space="0" w:color="auto"/>
+          <w:right w:val="single" w:sz="4" w:space="0" w:color="auto"/>
+          <w:insideH w:val="single" w:sz="4" w:space="0" w:color="auto"/>
+          <w:insideV w:val="single" w:sz="4" w:space="0" w:color="auto"/>
+        </w:tblBorders>
         <w:tblLayout w:type="fixed"/>
         <w:tblLook w:val="04A0" w:firstRow="1" w:lastRow="0" w:firstColumn="1" w:lastColumn="0" w:noHBand="0" w:noVBand="1"/>
       </w:tblPr>
@@ -28667,9 +28810,16 @@
     </w:p>
     <w:tbl>
       <w:tblPr>
-        <w:tblStyle w:val="a9"/>
         <w:tblW w:w="0" w:type="auto"/>
         <w:jc w:val="center"/>
+        <w:tblBorders>
+          <w:top w:val="single" w:sz="4" w:space="0" w:color="auto"/>
+          <w:left w:val="single" w:sz="4" w:space="0" w:color="auto"/>
+          <w:bottom w:val="single" w:sz="4" w:space="0" w:color="auto"/>
+          <w:right w:val="single" w:sz="4" w:space="0" w:color="auto"/>
+          <w:insideH w:val="single" w:sz="4" w:space="0" w:color="auto"/>
+          <w:insideV w:val="single" w:sz="4" w:space="0" w:color="auto"/>
+        </w:tblBorders>
         <w:tblLayout w:type="fixed"/>
         <w:tblLook w:val="04A0" w:firstRow="1" w:lastRow="0" w:firstColumn="1" w:lastColumn="0" w:noHBand="0" w:noVBand="1"/>
       </w:tblPr>
@@ -29237,9 +29387,16 @@
     </w:p>
     <w:tbl>
       <w:tblPr>
-        <w:tblStyle w:val="a9"/>
         <w:tblW w:w="0" w:type="auto"/>
         <w:jc w:val="center"/>
+        <w:tblBorders>
+          <w:top w:val="single" w:sz="4" w:space="0" w:color="auto"/>
+          <w:left w:val="single" w:sz="4" w:space="0" w:color="auto"/>
+          <w:bottom w:val="single" w:sz="4" w:space="0" w:color="auto"/>
+          <w:right w:val="single" w:sz="4" w:space="0" w:color="auto"/>
+          <w:insideH w:val="single" w:sz="4" w:space="0" w:color="auto"/>
+          <w:insideV w:val="single" w:sz="4" w:space="0" w:color="auto"/>
+        </w:tblBorders>
         <w:tblLayout w:type="fixed"/>
         <w:tblLook w:val="04A0" w:firstRow="1" w:lastRow="0" w:firstColumn="1" w:lastColumn="0" w:noHBand="0" w:noVBand="1"/>
       </w:tblPr>
@@ -29782,9 +29939,16 @@
     </w:p>
     <w:tbl>
       <w:tblPr>
-        <w:tblStyle w:val="a9"/>
         <w:tblW w:w="0" w:type="auto"/>
         <w:jc w:val="center"/>
+        <w:tblBorders>
+          <w:top w:val="single" w:sz="4" w:space="0" w:color="auto"/>
+          <w:left w:val="single" w:sz="4" w:space="0" w:color="auto"/>
+          <w:bottom w:val="single" w:sz="4" w:space="0" w:color="auto"/>
+          <w:right w:val="single" w:sz="4" w:space="0" w:color="auto"/>
+          <w:insideH w:val="single" w:sz="4" w:space="0" w:color="auto"/>
+          <w:insideV w:val="single" w:sz="4" w:space="0" w:color="auto"/>
+        </w:tblBorders>
         <w:tblLayout w:type="fixed"/>
         <w:tblLook w:val="04A0" w:firstRow="1" w:lastRow="0" w:firstColumn="1" w:lastColumn="0" w:noHBand="0" w:noVBand="1"/>
       </w:tblPr>
@@ -30328,9 +30492,16 @@
     </w:p>
     <w:tbl>
       <w:tblPr>
-        <w:tblStyle w:val="a9"/>
         <w:tblW w:w="0" w:type="auto"/>
         <w:jc w:val="center"/>
+        <w:tblBorders>
+          <w:top w:val="single" w:sz="4" w:space="0" w:color="auto"/>
+          <w:left w:val="single" w:sz="4" w:space="0" w:color="auto"/>
+          <w:bottom w:val="single" w:sz="4" w:space="0" w:color="auto"/>
+          <w:right w:val="single" w:sz="4" w:space="0" w:color="auto"/>
+          <w:insideH w:val="single" w:sz="4" w:space="0" w:color="auto"/>
+          <w:insideV w:val="single" w:sz="4" w:space="0" w:color="auto"/>
+        </w:tblBorders>
         <w:tblLayout w:type="fixed"/>
         <w:tblLook w:val="04A0" w:firstRow="1" w:lastRow="0" w:firstColumn="1" w:lastColumn="0" w:noHBand="0" w:noVBand="1"/>
       </w:tblPr>
@@ -30873,9 +31044,16 @@
     </w:p>
     <w:tbl>
       <w:tblPr>
-        <w:tblStyle w:val="a9"/>
         <w:tblW w:w="0" w:type="auto"/>
         <w:jc w:val="center"/>
+        <w:tblBorders>
+          <w:top w:val="single" w:sz="4" w:space="0" w:color="auto"/>
+          <w:left w:val="single" w:sz="4" w:space="0" w:color="auto"/>
+          <w:bottom w:val="single" w:sz="4" w:space="0" w:color="auto"/>
+          <w:right w:val="single" w:sz="4" w:space="0" w:color="auto"/>
+          <w:insideH w:val="single" w:sz="4" w:space="0" w:color="auto"/>
+          <w:insideV w:val="single" w:sz="4" w:space="0" w:color="auto"/>
+        </w:tblBorders>
         <w:tblLayout w:type="fixed"/>
         <w:tblLook w:val="04A0" w:firstRow="1" w:lastRow="0" w:firstColumn="1" w:lastColumn="0" w:noHBand="0" w:noVBand="1"/>
       </w:tblPr>
@@ -31419,9 +31597,16 @@
     </w:p>
     <w:tbl>
       <w:tblPr>
-        <w:tblStyle w:val="a9"/>
         <w:tblW w:w="0" w:type="auto"/>
         <w:jc w:val="center"/>
+        <w:tblBorders>
+          <w:top w:val="single" w:sz="4" w:space="0" w:color="auto"/>
+          <w:left w:val="single" w:sz="4" w:space="0" w:color="auto"/>
+          <w:bottom w:val="single" w:sz="4" w:space="0" w:color="auto"/>
+          <w:right w:val="single" w:sz="4" w:space="0" w:color="auto"/>
+          <w:insideH w:val="single" w:sz="4" w:space="0" w:color="auto"/>
+          <w:insideV w:val="single" w:sz="4" w:space="0" w:color="auto"/>
+        </w:tblBorders>
         <w:tblLayout w:type="fixed"/>
         <w:tblLook w:val="04A0" w:firstRow="1" w:lastRow="0" w:firstColumn="1" w:lastColumn="0" w:noHBand="0" w:noVBand="1"/>
       </w:tblPr>
@@ -31989,9 +32174,16 @@
     </w:p>
     <w:tbl>
       <w:tblPr>
-        <w:tblStyle w:val="a9"/>
         <w:tblW w:w="0" w:type="auto"/>
         <w:jc w:val="center"/>
+        <w:tblBorders>
+          <w:top w:val="single" w:sz="4" w:space="0" w:color="auto"/>
+          <w:left w:val="single" w:sz="4" w:space="0" w:color="auto"/>
+          <w:bottom w:val="single" w:sz="4" w:space="0" w:color="auto"/>
+          <w:right w:val="single" w:sz="4" w:space="0" w:color="auto"/>
+          <w:insideH w:val="single" w:sz="4" w:space="0" w:color="auto"/>
+          <w:insideV w:val="single" w:sz="4" w:space="0" w:color="auto"/>
+        </w:tblBorders>
         <w:tblLayout w:type="fixed"/>
         <w:tblLook w:val="04A0" w:firstRow="1" w:lastRow="0" w:firstColumn="1" w:lastColumn="0" w:noHBand="0" w:noVBand="1"/>
       </w:tblPr>
@@ -32549,9 +32741,16 @@
     </w:p>
     <w:tbl>
       <w:tblPr>
-        <w:tblStyle w:val="a9"/>
         <w:tblW w:w="0" w:type="auto"/>
         <w:jc w:val="center"/>
+        <w:tblBorders>
+          <w:top w:val="single" w:sz="4" w:space="0" w:color="auto"/>
+          <w:left w:val="single" w:sz="4" w:space="0" w:color="auto"/>
+          <w:bottom w:val="single" w:sz="4" w:space="0" w:color="auto"/>
+          <w:right w:val="single" w:sz="4" w:space="0" w:color="auto"/>
+          <w:insideH w:val="single" w:sz="4" w:space="0" w:color="auto"/>
+          <w:insideV w:val="single" w:sz="4" w:space="0" w:color="auto"/>
+        </w:tblBorders>
         <w:tblLayout w:type="fixed"/>
         <w:tblLook w:val="04A0" w:firstRow="1" w:lastRow="0" w:firstColumn="1" w:lastColumn="0" w:noHBand="0" w:noVBand="1"/>
       </w:tblPr>
@@ -33110,9 +33309,16 @@
     </w:p>
     <w:tbl>
       <w:tblPr>
-        <w:tblStyle w:val="a9"/>
         <w:tblW w:w="0" w:type="auto"/>
         <w:jc w:val="center"/>
+        <w:tblBorders>
+          <w:top w:val="single" w:sz="4" w:space="0" w:color="auto"/>
+          <w:left w:val="single" w:sz="4" w:space="0" w:color="auto"/>
+          <w:bottom w:val="single" w:sz="4" w:space="0" w:color="auto"/>
+          <w:right w:val="single" w:sz="4" w:space="0" w:color="auto"/>
+          <w:insideH w:val="single" w:sz="4" w:space="0" w:color="auto"/>
+          <w:insideV w:val="single" w:sz="4" w:space="0" w:color="auto"/>
+        </w:tblBorders>
         <w:tblLayout w:type="fixed"/>
         <w:tblLook w:val="04A0" w:firstRow="1" w:lastRow="0" w:firstColumn="1" w:lastColumn="0" w:noHBand="0" w:noVBand="1"/>
       </w:tblPr>
@@ -33640,9 +33846,16 @@
     </w:p>
     <w:tbl>
       <w:tblPr>
-        <w:tblStyle w:val="a9"/>
         <w:tblW w:w="0" w:type="auto"/>
         <w:jc w:val="center"/>
+        <w:tblBorders>
+          <w:top w:val="single" w:sz="4" w:space="0" w:color="auto"/>
+          <w:left w:val="single" w:sz="4" w:space="0" w:color="auto"/>
+          <w:bottom w:val="single" w:sz="4" w:space="0" w:color="auto"/>
+          <w:right w:val="single" w:sz="4" w:space="0" w:color="auto"/>
+          <w:insideH w:val="single" w:sz="4" w:space="0" w:color="auto"/>
+          <w:insideV w:val="single" w:sz="4" w:space="0" w:color="auto"/>
+        </w:tblBorders>
         <w:tblLayout w:type="fixed"/>
         <w:tblLook w:val="04A0" w:firstRow="1" w:lastRow="0" w:firstColumn="1" w:lastColumn="0" w:noHBand="0" w:noVBand="1"/>
       </w:tblPr>
@@ -34186,9 +34399,16 @@
     </w:p>
     <w:tbl>
       <w:tblPr>
-        <w:tblStyle w:val="a9"/>
         <w:tblW w:w="0" w:type="auto"/>
         <w:jc w:val="center"/>
+        <w:tblBorders>
+          <w:top w:val="single" w:sz="4" w:space="0" w:color="auto"/>
+          <w:left w:val="single" w:sz="4" w:space="0" w:color="auto"/>
+          <w:bottom w:val="single" w:sz="4" w:space="0" w:color="auto"/>
+          <w:right w:val="single" w:sz="4" w:space="0" w:color="auto"/>
+          <w:insideH w:val="single" w:sz="4" w:space="0" w:color="auto"/>
+          <w:insideV w:val="single" w:sz="4" w:space="0" w:color="auto"/>
+        </w:tblBorders>
         <w:tblLayout w:type="fixed"/>
         <w:tblLook w:val="04A0" w:firstRow="1" w:lastRow="0" w:firstColumn="1" w:lastColumn="0" w:noHBand="0" w:noVBand="1"/>
       </w:tblPr>
@@ -34741,9 +34961,16 @@
     </w:p>
     <w:tbl>
       <w:tblPr>
-        <w:tblStyle w:val="a9"/>
         <w:tblW w:w="0" w:type="auto"/>
         <w:jc w:val="center"/>
+        <w:tblBorders>
+          <w:top w:val="single" w:sz="4" w:space="0" w:color="auto"/>
+          <w:left w:val="single" w:sz="4" w:space="0" w:color="auto"/>
+          <w:bottom w:val="single" w:sz="4" w:space="0" w:color="auto"/>
+          <w:right w:val="single" w:sz="4" w:space="0" w:color="auto"/>
+          <w:insideH w:val="single" w:sz="4" w:space="0" w:color="auto"/>
+          <w:insideV w:val="single" w:sz="4" w:space="0" w:color="auto"/>
+        </w:tblBorders>
         <w:tblLayout w:type="fixed"/>
         <w:tblLook w:val="04A0" w:firstRow="1" w:lastRow="0" w:firstColumn="1" w:lastColumn="0" w:noHBand="0" w:noVBand="1"/>
       </w:tblPr>
@@ -35301,9 +35528,16 @@
     </w:p>
     <w:tbl>
       <w:tblPr>
-        <w:tblStyle w:val="a9"/>
         <w:tblW w:w="0" w:type="auto"/>
         <w:jc w:val="center"/>
+        <w:tblBorders>
+          <w:top w:val="single" w:sz="4" w:space="0" w:color="auto"/>
+          <w:left w:val="single" w:sz="4" w:space="0" w:color="auto"/>
+          <w:bottom w:val="single" w:sz="4" w:space="0" w:color="auto"/>
+          <w:right w:val="single" w:sz="4" w:space="0" w:color="auto"/>
+          <w:insideH w:val="single" w:sz="4" w:space="0" w:color="auto"/>
+          <w:insideV w:val="single" w:sz="4" w:space="0" w:color="auto"/>
+        </w:tblBorders>
         <w:tblLayout w:type="fixed"/>
         <w:tblLook w:val="04A0" w:firstRow="1" w:lastRow="0" w:firstColumn="1" w:lastColumn="0" w:noHBand="0" w:noVBand="1"/>
       </w:tblPr>
@@ -35862,9 +36096,16 @@
     </w:p>
     <w:tbl>
       <w:tblPr>
-        <w:tblStyle w:val="a9"/>
         <w:tblW w:w="0" w:type="auto"/>
         <w:jc w:val="center"/>
+        <w:tblBorders>
+          <w:top w:val="single" w:sz="4" w:space="0" w:color="auto"/>
+          <w:left w:val="single" w:sz="4" w:space="0" w:color="auto"/>
+          <w:bottom w:val="single" w:sz="4" w:space="0" w:color="auto"/>
+          <w:right w:val="single" w:sz="4" w:space="0" w:color="auto"/>
+          <w:insideH w:val="single" w:sz="4" w:space="0" w:color="auto"/>
+          <w:insideV w:val="single" w:sz="4" w:space="0" w:color="auto"/>
+        </w:tblBorders>
         <w:tblLayout w:type="fixed"/>
         <w:tblLook w:val="04A0" w:firstRow="1" w:lastRow="0" w:firstColumn="1" w:lastColumn="0" w:noHBand="0" w:noVBand="1"/>
       </w:tblPr>
@@ -36407,9 +36648,16 @@
     </w:p>
     <w:tbl>
       <w:tblPr>
-        <w:tblStyle w:val="a9"/>
         <w:tblW w:w="0" w:type="auto"/>
         <w:jc w:val="center"/>
+        <w:tblBorders>
+          <w:top w:val="single" w:sz="4" w:space="0" w:color="auto"/>
+          <w:left w:val="single" w:sz="4" w:space="0" w:color="auto"/>
+          <w:bottom w:val="single" w:sz="4" w:space="0" w:color="auto"/>
+          <w:right w:val="single" w:sz="4" w:space="0" w:color="auto"/>
+          <w:insideH w:val="single" w:sz="4" w:space="0" w:color="auto"/>
+          <w:insideV w:val="single" w:sz="4" w:space="0" w:color="auto"/>
+        </w:tblBorders>
         <w:tblLayout w:type="fixed"/>
         <w:tblLook w:val="04A0" w:firstRow="1" w:lastRow="0" w:firstColumn="1" w:lastColumn="0" w:noHBand="0" w:noVBand="1"/>
       </w:tblPr>
@@ -36977,9 +37225,16 @@
     </w:p>
     <w:tbl>
       <w:tblPr>
-        <w:tblStyle w:val="a9"/>
         <w:tblW w:w="0" w:type="auto"/>
         <w:jc w:val="center"/>
+        <w:tblBorders>
+          <w:top w:val="single" w:sz="4" w:space="0" w:color="auto"/>
+          <w:left w:val="single" w:sz="4" w:space="0" w:color="auto"/>
+          <w:bottom w:val="single" w:sz="4" w:space="0" w:color="auto"/>
+          <w:right w:val="single" w:sz="4" w:space="0" w:color="auto"/>
+          <w:insideH w:val="single" w:sz="4" w:space="0" w:color="auto"/>
+          <w:insideV w:val="single" w:sz="4" w:space="0" w:color="auto"/>
+        </w:tblBorders>
         <w:tblLayout w:type="fixed"/>
         <w:tblLook w:val="04A0" w:firstRow="1" w:lastRow="0" w:firstColumn="1" w:lastColumn="0" w:noHBand="0" w:noVBand="1"/>
       </w:tblPr>
@@ -37523,9 +37778,16 @@
     </w:p>
     <w:tbl>
       <w:tblPr>
-        <w:tblStyle w:val="a9"/>
         <w:tblW w:w="0" w:type="auto"/>
         <w:jc w:val="center"/>
+        <w:tblBorders>
+          <w:top w:val="single" w:sz="4" w:space="0" w:color="auto"/>
+          <w:left w:val="single" w:sz="4" w:space="0" w:color="auto"/>
+          <w:bottom w:val="single" w:sz="4" w:space="0" w:color="auto"/>
+          <w:right w:val="single" w:sz="4" w:space="0" w:color="auto"/>
+          <w:insideH w:val="single" w:sz="4" w:space="0" w:color="auto"/>
+          <w:insideV w:val="single" w:sz="4" w:space="0" w:color="auto"/>
+        </w:tblBorders>
         <w:tblLayout w:type="fixed"/>
         <w:tblLook w:val="04A0" w:firstRow="1" w:lastRow="0" w:firstColumn="1" w:lastColumn="0" w:noHBand="0" w:noVBand="1"/>
       </w:tblPr>
@@ -38053,9 +38315,16 @@
     </w:p>
     <w:tbl>
       <w:tblPr>
-        <w:tblStyle w:val="a9"/>
         <w:tblW w:w="0" w:type="auto"/>
         <w:jc w:val="center"/>
+        <w:tblBorders>
+          <w:top w:val="single" w:sz="4" w:space="0" w:color="auto"/>
+          <w:left w:val="single" w:sz="4" w:space="0" w:color="auto"/>
+          <w:bottom w:val="single" w:sz="4" w:space="0" w:color="auto"/>
+          <w:right w:val="single" w:sz="4" w:space="0" w:color="auto"/>
+          <w:insideH w:val="single" w:sz="4" w:space="0" w:color="auto"/>
+          <w:insideV w:val="single" w:sz="4" w:space="0" w:color="auto"/>
+        </w:tblBorders>
         <w:tblLayout w:type="fixed"/>
         <w:tblLook w:val="04A0" w:firstRow="1" w:lastRow="0" w:firstColumn="1" w:lastColumn="0" w:noHBand="0" w:noVBand="1"/>
       </w:tblPr>
@@ -38623,9 +38892,16 @@
     </w:p>
     <w:tbl>
       <w:tblPr>
-        <w:tblStyle w:val="a9"/>
         <w:tblW w:w="0" w:type="auto"/>
         <w:jc w:val="center"/>
+        <w:tblBorders>
+          <w:top w:val="single" w:sz="4" w:space="0" w:color="auto"/>
+          <w:left w:val="single" w:sz="4" w:space="0" w:color="auto"/>
+          <w:bottom w:val="single" w:sz="4" w:space="0" w:color="auto"/>
+          <w:right w:val="single" w:sz="4" w:space="0" w:color="auto"/>
+          <w:insideH w:val="single" w:sz="4" w:space="0" w:color="auto"/>
+          <w:insideV w:val="single" w:sz="4" w:space="0" w:color="auto"/>
+        </w:tblBorders>
         <w:tblLayout w:type="fixed"/>
         <w:tblLook w:val="04A0" w:firstRow="1" w:lastRow="0" w:firstColumn="1" w:lastColumn="0" w:noHBand="0" w:noVBand="1"/>
       </w:tblPr>
@@ -39168,9 +39444,16 @@
     </w:p>
     <w:tbl>
       <w:tblPr>
-        <w:tblStyle w:val="a9"/>
         <w:tblW w:w="0" w:type="auto"/>
         <w:jc w:val="center"/>
+        <w:tblBorders>
+          <w:top w:val="single" w:sz="4" w:space="0" w:color="auto"/>
+          <w:left w:val="single" w:sz="4" w:space="0" w:color="auto"/>
+          <w:bottom w:val="single" w:sz="4" w:space="0" w:color="auto"/>
+          <w:right w:val="single" w:sz="4" w:space="0" w:color="auto"/>
+          <w:insideH w:val="single" w:sz="4" w:space="0" w:color="auto"/>
+          <w:insideV w:val="single" w:sz="4" w:space="0" w:color="auto"/>
+        </w:tblBorders>
         <w:tblLayout w:type="fixed"/>
         <w:tblLook w:val="04A0" w:firstRow="1" w:lastRow="0" w:firstColumn="1" w:lastColumn="0" w:noHBand="0" w:noVBand="1"/>
       </w:tblPr>
@@ -39783,9 +40066,16 @@
     </w:p>
     <w:tbl>
       <w:tblPr>
-        <w:tblStyle w:val="a9"/>
         <w:tblW w:w="0" w:type="auto"/>
         <w:jc w:val="center"/>
+        <w:tblBorders>
+          <w:top w:val="single" w:sz="4" w:space="0" w:color="auto"/>
+          <w:left w:val="single" w:sz="4" w:space="0" w:color="auto"/>
+          <w:bottom w:val="single" w:sz="4" w:space="0" w:color="auto"/>
+          <w:right w:val="single" w:sz="4" w:space="0" w:color="auto"/>
+          <w:insideH w:val="single" w:sz="4" w:space="0" w:color="auto"/>
+          <w:insideV w:val="single" w:sz="4" w:space="0" w:color="auto"/>
+        </w:tblBorders>
         <w:tblLayout w:type="fixed"/>
         <w:tblLook w:val="04A0" w:firstRow="1" w:lastRow="0" w:firstColumn="1" w:lastColumn="0" w:noHBand="0" w:noVBand="1"/>
       </w:tblPr>
@@ -39960,12 +40250,14 @@
                 <w:rFonts w:hint="eastAsia"/>
               </w:rPr>
             </w:pPr>
+            <w:proofErr w:type="spellStart"/>
             <w:r>
               <w:rPr>
                 <w:sz w:val="17"/>
               </w:rPr>
               <w:t>user_id</w:t>
             </w:r>
+            <w:proofErr w:type="spellEnd"/>
           </w:p>
         </w:tc>
         <w:tc>
@@ -40224,12 +40516,14 @@
                 <w:rFonts w:hint="eastAsia"/>
               </w:rPr>
             </w:pPr>
+            <w:proofErr w:type="spellStart"/>
             <w:r>
               <w:rPr>
                 <w:sz w:val="17"/>
               </w:rPr>
               <w:t>password_hash</w:t>
             </w:r>
+            <w:proofErr w:type="spellEnd"/>
           </w:p>
         </w:tc>
         <w:tc>
@@ -40488,12 +40782,14 @@
                 <w:rFonts w:hint="eastAsia"/>
               </w:rPr>
             </w:pPr>
+            <w:proofErr w:type="spellStart"/>
             <w:r>
               <w:rPr>
                 <w:sz w:val="17"/>
               </w:rPr>
               <w:t>avatar_url</w:t>
             </w:r>
+            <w:proofErr w:type="spellEnd"/>
           </w:p>
         </w:tc>
         <w:tc>
@@ -40752,12 +41048,14 @@
                 <w:rFonts w:hint="eastAsia"/>
               </w:rPr>
             </w:pPr>
+            <w:proofErr w:type="spellStart"/>
             <w:r>
               <w:rPr>
                 <w:sz w:val="17"/>
               </w:rPr>
               <w:t>created_at</w:t>
             </w:r>
+            <w:proofErr w:type="spellEnd"/>
           </w:p>
         </w:tc>
         <w:tc>
@@ -40911,9 +41209,16 @@
     </w:p>
     <w:tbl>
       <w:tblPr>
-        <w:tblStyle w:val="a9"/>
         <w:tblW w:w="0" w:type="auto"/>
         <w:jc w:val="center"/>
+        <w:tblBorders>
+          <w:top w:val="single" w:sz="4" w:space="0" w:color="auto"/>
+          <w:left w:val="single" w:sz="4" w:space="0" w:color="auto"/>
+          <w:bottom w:val="single" w:sz="4" w:space="0" w:color="auto"/>
+          <w:right w:val="single" w:sz="4" w:space="0" w:color="auto"/>
+          <w:insideH w:val="single" w:sz="4" w:space="0" w:color="auto"/>
+          <w:insideV w:val="single" w:sz="4" w:space="0" w:color="auto"/>
+        </w:tblBorders>
         <w:tblLayout w:type="fixed"/>
         <w:tblLook w:val="04A0" w:firstRow="1" w:lastRow="0" w:firstColumn="1" w:lastColumn="0" w:noHBand="0" w:noVBand="1"/>
       </w:tblPr>
@@ -41088,12 +41393,14 @@
                 <w:rFonts w:hint="eastAsia"/>
               </w:rPr>
             </w:pPr>
+            <w:proofErr w:type="spellStart"/>
             <w:r>
               <w:rPr>
                 <w:sz w:val="17"/>
               </w:rPr>
               <w:t>group_id</w:t>
             </w:r>
+            <w:proofErr w:type="spellEnd"/>
           </w:p>
         </w:tc>
         <w:tc>
@@ -41484,12 +41791,14 @@
                 <w:rFonts w:hint="eastAsia"/>
               </w:rPr>
             </w:pPr>
+            <w:proofErr w:type="spellStart"/>
             <w:r>
               <w:rPr>
                 <w:sz w:val="17"/>
               </w:rPr>
               <w:t>leader_id</w:t>
             </w:r>
+            <w:proofErr w:type="spellEnd"/>
           </w:p>
         </w:tc>
         <w:tc>
@@ -41748,12 +42057,14 @@
                 <w:rFonts w:hint="eastAsia"/>
               </w:rPr>
             </w:pPr>
+            <w:proofErr w:type="spellStart"/>
             <w:r>
               <w:rPr>
                 <w:sz w:val="17"/>
               </w:rPr>
               <w:t>created_at</w:t>
             </w:r>
+            <w:proofErr w:type="spellEnd"/>
           </w:p>
         </w:tc>
         <w:tc>
@@ -41906,9 +42217,16 @@
     </w:p>
     <w:tbl>
       <w:tblPr>
-        <w:tblStyle w:val="a9"/>
         <w:tblW w:w="0" w:type="auto"/>
         <w:jc w:val="center"/>
+        <w:tblBorders>
+          <w:top w:val="single" w:sz="4" w:space="0" w:color="auto"/>
+          <w:left w:val="single" w:sz="4" w:space="0" w:color="auto"/>
+          <w:bottom w:val="single" w:sz="4" w:space="0" w:color="auto"/>
+          <w:right w:val="single" w:sz="4" w:space="0" w:color="auto"/>
+          <w:insideH w:val="single" w:sz="4" w:space="0" w:color="auto"/>
+          <w:insideV w:val="single" w:sz="4" w:space="0" w:color="auto"/>
+        </w:tblBorders>
         <w:tblLayout w:type="fixed"/>
         <w:tblLook w:val="04A0" w:firstRow="1" w:lastRow="0" w:firstColumn="1" w:lastColumn="0" w:noHBand="0" w:noVBand="1"/>
       </w:tblPr>
@@ -42083,12 +42401,14 @@
                 <w:rFonts w:hint="eastAsia"/>
               </w:rPr>
             </w:pPr>
+            <w:proofErr w:type="spellStart"/>
             <w:r>
               <w:rPr>
                 <w:sz w:val="17"/>
               </w:rPr>
               <w:t>membership_id</w:t>
             </w:r>
+            <w:proofErr w:type="spellEnd"/>
           </w:p>
         </w:tc>
         <w:tc>
@@ -42215,12 +42535,14 @@
                 <w:rFonts w:hint="eastAsia"/>
               </w:rPr>
             </w:pPr>
+            <w:proofErr w:type="spellStart"/>
             <w:r>
               <w:rPr>
                 <w:sz w:val="17"/>
               </w:rPr>
               <w:t>group_id</w:t>
             </w:r>
+            <w:proofErr w:type="spellEnd"/>
           </w:p>
         </w:tc>
         <w:tc>
@@ -42347,12 +42669,14 @@
                 <w:rFonts w:hint="eastAsia"/>
               </w:rPr>
             </w:pPr>
+            <w:proofErr w:type="spellStart"/>
             <w:r>
               <w:rPr>
                 <w:sz w:val="17"/>
               </w:rPr>
               <w:t>user_id</w:t>
             </w:r>
+            <w:proofErr w:type="spellEnd"/>
           </w:p>
         </w:tc>
         <w:tc>
@@ -42743,12 +43067,14 @@
                 <w:rFonts w:hint="eastAsia"/>
               </w:rPr>
             </w:pPr>
+            <w:proofErr w:type="spellStart"/>
             <w:r>
               <w:rPr>
                 <w:sz w:val="17"/>
               </w:rPr>
               <w:t>joined_at</w:t>
             </w:r>
+            <w:proofErr w:type="spellEnd"/>
           </w:p>
         </w:tc>
         <w:tc>
@@ -42901,9 +43227,16 @@
     </w:p>
     <w:tbl>
       <w:tblPr>
-        <w:tblStyle w:val="a9"/>
         <w:tblW w:w="0" w:type="auto"/>
         <w:jc w:val="center"/>
+        <w:tblBorders>
+          <w:top w:val="single" w:sz="4" w:space="0" w:color="auto"/>
+          <w:left w:val="single" w:sz="4" w:space="0" w:color="auto"/>
+          <w:bottom w:val="single" w:sz="4" w:space="0" w:color="auto"/>
+          <w:right w:val="single" w:sz="4" w:space="0" w:color="auto"/>
+          <w:insideH w:val="single" w:sz="4" w:space="0" w:color="auto"/>
+          <w:insideV w:val="single" w:sz="4" w:space="0" w:color="auto"/>
+        </w:tblBorders>
         <w:tblLayout w:type="fixed"/>
         <w:tblLook w:val="04A0" w:firstRow="1" w:lastRow="0" w:firstColumn="1" w:lastColumn="0" w:noHBand="0" w:noVBand="1"/>
       </w:tblPr>
@@ -43078,12 +43411,14 @@
                 <w:rFonts w:hint="eastAsia"/>
               </w:rPr>
             </w:pPr>
+            <w:proofErr w:type="spellStart"/>
             <w:r>
               <w:rPr>
                 <w:sz w:val="17"/>
               </w:rPr>
               <w:t>grant_id</w:t>
             </w:r>
+            <w:proofErr w:type="spellEnd"/>
           </w:p>
         </w:tc>
         <w:tc>
@@ -43210,12 +43545,14 @@
                 <w:rFonts w:hint="eastAsia"/>
               </w:rPr>
             </w:pPr>
+            <w:proofErr w:type="spellStart"/>
             <w:r>
               <w:rPr>
                 <w:sz w:val="17"/>
               </w:rPr>
               <w:t>group_id</w:t>
             </w:r>
+            <w:proofErr w:type="spellEnd"/>
           </w:p>
         </w:tc>
         <w:tc>
@@ -43342,12 +43679,14 @@
                 <w:rFonts w:hint="eastAsia"/>
               </w:rPr>
             </w:pPr>
+            <w:proofErr w:type="spellStart"/>
             <w:r>
               <w:rPr>
                 <w:sz w:val="17"/>
               </w:rPr>
               <w:t>user_id</w:t>
             </w:r>
+            <w:proofErr w:type="spellEnd"/>
           </w:p>
         </w:tc>
         <w:tc>
@@ -43606,12 +43945,14 @@
                 <w:rFonts w:hint="eastAsia"/>
               </w:rPr>
             </w:pPr>
+            <w:proofErr w:type="spellStart"/>
             <w:r>
               <w:rPr>
                 <w:sz w:val="17"/>
               </w:rPr>
               <w:t>granted_by</w:t>
             </w:r>
+            <w:proofErr w:type="spellEnd"/>
           </w:p>
         </w:tc>
         <w:tc>
@@ -43738,6 +44079,7 @@
                 <w:rFonts w:hint="eastAsia"/>
               </w:rPr>
             </w:pPr>
+            <w:proofErr w:type="spellStart"/>
             <w:r>
               <w:rPr>
                 <w:sz w:val="17"/>
@@ -43745,6 +44087,7 @@
               <w:lastRenderedPageBreak/>
               <w:t>revoked_at</w:t>
             </w:r>
+            <w:proofErr w:type="spellEnd"/>
           </w:p>
         </w:tc>
         <w:tc>
@@ -43897,9 +44240,16 @@
     </w:p>
     <w:tbl>
       <w:tblPr>
-        <w:tblStyle w:val="a9"/>
         <w:tblW w:w="0" w:type="auto"/>
         <w:jc w:val="center"/>
+        <w:tblBorders>
+          <w:top w:val="single" w:sz="4" w:space="0" w:color="auto"/>
+          <w:left w:val="single" w:sz="4" w:space="0" w:color="auto"/>
+          <w:bottom w:val="single" w:sz="4" w:space="0" w:color="auto"/>
+          <w:right w:val="single" w:sz="4" w:space="0" w:color="auto"/>
+          <w:insideH w:val="single" w:sz="4" w:space="0" w:color="auto"/>
+          <w:insideV w:val="single" w:sz="4" w:space="0" w:color="auto"/>
+        </w:tblBorders>
         <w:tblLayout w:type="fixed"/>
         <w:tblLook w:val="04A0" w:firstRow="1" w:lastRow="0" w:firstColumn="1" w:lastColumn="0" w:noHBand="0" w:noVBand="1"/>
       </w:tblPr>
@@ -44074,12 +44424,14 @@
                 <w:rFonts w:hint="eastAsia"/>
               </w:rPr>
             </w:pPr>
+            <w:proofErr w:type="spellStart"/>
             <w:r>
               <w:rPr>
                 <w:sz w:val="17"/>
               </w:rPr>
               <w:t>task_id</w:t>
             </w:r>
+            <w:proofErr w:type="spellEnd"/>
           </w:p>
         </w:tc>
         <w:tc>
@@ -44206,12 +44558,14 @@
                 <w:rFonts w:hint="eastAsia"/>
               </w:rPr>
             </w:pPr>
+            <w:proofErr w:type="spellStart"/>
             <w:r>
               <w:rPr>
                 <w:sz w:val="17"/>
               </w:rPr>
               <w:t>group_id</w:t>
             </w:r>
+            <w:proofErr w:type="spellEnd"/>
           </w:p>
         </w:tc>
         <w:tc>
@@ -44998,12 +45352,14 @@
                 <w:rFonts w:hint="eastAsia"/>
               </w:rPr>
             </w:pPr>
+            <w:proofErr w:type="spellStart"/>
             <w:r>
               <w:rPr>
                 <w:sz w:val="17"/>
               </w:rPr>
               <w:t>created_by</w:t>
             </w:r>
+            <w:proofErr w:type="spellEnd"/>
           </w:p>
         </w:tc>
         <w:tc>
@@ -45156,9 +45512,16 @@
     </w:p>
     <w:tbl>
       <w:tblPr>
-        <w:tblStyle w:val="a9"/>
         <w:tblW w:w="0" w:type="auto"/>
         <w:jc w:val="center"/>
+        <w:tblBorders>
+          <w:top w:val="single" w:sz="4" w:space="0" w:color="auto"/>
+          <w:left w:val="single" w:sz="4" w:space="0" w:color="auto"/>
+          <w:bottom w:val="single" w:sz="4" w:space="0" w:color="auto"/>
+          <w:right w:val="single" w:sz="4" w:space="0" w:color="auto"/>
+          <w:insideH w:val="single" w:sz="4" w:space="0" w:color="auto"/>
+          <w:insideV w:val="single" w:sz="4" w:space="0" w:color="auto"/>
+        </w:tblBorders>
         <w:tblLayout w:type="fixed"/>
         <w:tblLook w:val="04A0" w:firstRow="1" w:lastRow="0" w:firstColumn="1" w:lastColumn="0" w:noHBand="0" w:noVBand="1"/>
       </w:tblPr>
@@ -45333,12 +45696,14 @@
                 <w:rFonts w:hint="eastAsia"/>
               </w:rPr>
             </w:pPr>
+            <w:proofErr w:type="spellStart"/>
             <w:r>
               <w:rPr>
                 <w:sz w:val="17"/>
               </w:rPr>
               <w:t>task_id</w:t>
             </w:r>
+            <w:proofErr w:type="spellEnd"/>
           </w:p>
         </w:tc>
         <w:tc>
@@ -45465,12 +45830,14 @@
                 <w:rFonts w:hint="eastAsia"/>
               </w:rPr>
             </w:pPr>
+            <w:proofErr w:type="spellStart"/>
             <w:r>
               <w:rPr>
                 <w:sz w:val="17"/>
               </w:rPr>
               <w:t>user_id</w:t>
             </w:r>
+            <w:proofErr w:type="spellEnd"/>
           </w:p>
         </w:tc>
         <w:tc>
@@ -45729,12 +46096,14 @@
                 <w:rFonts w:hint="eastAsia"/>
               </w:rPr>
             </w:pPr>
+            <w:proofErr w:type="spellStart"/>
             <w:r>
               <w:rPr>
                 <w:sz w:val="17"/>
               </w:rPr>
               <w:t>assigned_at</w:t>
             </w:r>
+            <w:proofErr w:type="spellEnd"/>
           </w:p>
         </w:tc>
         <w:tc>
@@ -45887,9 +46256,16 @@
     </w:p>
     <w:tbl>
       <w:tblPr>
-        <w:tblStyle w:val="a9"/>
         <w:tblW w:w="0" w:type="auto"/>
         <w:jc w:val="center"/>
+        <w:tblBorders>
+          <w:top w:val="single" w:sz="4" w:space="0" w:color="auto"/>
+          <w:left w:val="single" w:sz="4" w:space="0" w:color="auto"/>
+          <w:bottom w:val="single" w:sz="4" w:space="0" w:color="auto"/>
+          <w:right w:val="single" w:sz="4" w:space="0" w:color="auto"/>
+          <w:insideH w:val="single" w:sz="4" w:space="0" w:color="auto"/>
+          <w:insideV w:val="single" w:sz="4" w:space="0" w:color="auto"/>
+        </w:tblBorders>
         <w:tblLayout w:type="fixed"/>
         <w:tblLook w:val="04A0" w:firstRow="1" w:lastRow="0" w:firstColumn="1" w:lastColumn="0" w:noHBand="0" w:noVBand="1"/>
       </w:tblPr>
@@ -46064,12 +46440,14 @@
                 <w:rFonts w:hint="eastAsia"/>
               </w:rPr>
             </w:pPr>
+            <w:proofErr w:type="spellStart"/>
             <w:r>
               <w:rPr>
                 <w:sz w:val="17"/>
               </w:rPr>
               <w:t>submission_id</w:t>
             </w:r>
+            <w:proofErr w:type="spellEnd"/>
           </w:p>
         </w:tc>
         <w:tc>
@@ -46196,12 +46574,14 @@
                 <w:rFonts w:hint="eastAsia"/>
               </w:rPr>
             </w:pPr>
+            <w:proofErr w:type="spellStart"/>
             <w:r>
               <w:rPr>
                 <w:sz w:val="17"/>
               </w:rPr>
               <w:t>task_id</w:t>
             </w:r>
+            <w:proofErr w:type="spellEnd"/>
           </w:p>
         </w:tc>
         <w:tc>
@@ -46328,6 +46708,7 @@
                 <w:rFonts w:hint="eastAsia"/>
               </w:rPr>
             </w:pPr>
+            <w:proofErr w:type="spellStart"/>
             <w:r>
               <w:rPr>
                 <w:sz w:val="17"/>
@@ -46335,6 +46716,7 @@
               <w:lastRenderedPageBreak/>
               <w:t>version_no</w:t>
             </w:r>
+            <w:proofErr w:type="spellEnd"/>
           </w:p>
         </w:tc>
         <w:tc>
@@ -46461,12 +46843,14 @@
                 <w:rFonts w:hint="eastAsia"/>
               </w:rPr>
             </w:pPr>
+            <w:proofErr w:type="spellStart"/>
             <w:r>
               <w:rPr>
                 <w:sz w:val="17"/>
               </w:rPr>
               <w:t>submitter_id</w:t>
             </w:r>
+            <w:proofErr w:type="spellEnd"/>
           </w:p>
         </w:tc>
         <w:tc>
@@ -46725,12 +47109,14 @@
                 <w:rFonts w:hint="eastAsia"/>
               </w:rPr>
             </w:pPr>
+            <w:proofErr w:type="spellStart"/>
             <w:r>
               <w:rPr>
                 <w:sz w:val="17"/>
               </w:rPr>
               <w:t>submitted_at</w:t>
             </w:r>
+            <w:proofErr w:type="spellEnd"/>
           </w:p>
         </w:tc>
         <w:tc>
@@ -46883,9 +47269,16 @@
     </w:p>
     <w:tbl>
       <w:tblPr>
-        <w:tblStyle w:val="a9"/>
         <w:tblW w:w="0" w:type="auto"/>
         <w:jc w:val="center"/>
+        <w:tblBorders>
+          <w:top w:val="single" w:sz="4" w:space="0" w:color="auto"/>
+          <w:left w:val="single" w:sz="4" w:space="0" w:color="auto"/>
+          <w:bottom w:val="single" w:sz="4" w:space="0" w:color="auto"/>
+          <w:right w:val="single" w:sz="4" w:space="0" w:color="auto"/>
+          <w:insideH w:val="single" w:sz="4" w:space="0" w:color="auto"/>
+          <w:insideV w:val="single" w:sz="4" w:space="0" w:color="auto"/>
+        </w:tblBorders>
         <w:tblLayout w:type="fixed"/>
         <w:tblLook w:val="04A0" w:firstRow="1" w:lastRow="0" w:firstColumn="1" w:lastColumn="0" w:noHBand="0" w:noVBand="1"/>
       </w:tblPr>
@@ -47060,12 +47453,14 @@
                 <w:rFonts w:hint="eastAsia"/>
               </w:rPr>
             </w:pPr>
+            <w:proofErr w:type="spellStart"/>
             <w:r>
               <w:rPr>
                 <w:sz w:val="17"/>
               </w:rPr>
               <w:t>review_id</w:t>
             </w:r>
+            <w:proofErr w:type="spellEnd"/>
           </w:p>
         </w:tc>
         <w:tc>
@@ -47192,12 +47587,14 @@
                 <w:rFonts w:hint="eastAsia"/>
               </w:rPr>
             </w:pPr>
+            <w:proofErr w:type="spellStart"/>
             <w:r>
               <w:rPr>
                 <w:sz w:val="17"/>
               </w:rPr>
               <w:t>submission_id</w:t>
             </w:r>
+            <w:proofErr w:type="spellEnd"/>
           </w:p>
         </w:tc>
         <w:tc>
@@ -47324,12 +47721,14 @@
                 <w:rFonts w:hint="eastAsia"/>
               </w:rPr>
             </w:pPr>
+            <w:proofErr w:type="spellStart"/>
             <w:r>
               <w:rPr>
                 <w:sz w:val="17"/>
               </w:rPr>
               <w:t>reviewer_id</w:t>
             </w:r>
+            <w:proofErr w:type="spellEnd"/>
           </w:p>
         </w:tc>
         <w:tc>
@@ -47720,12 +48119,14 @@
                 <w:rFonts w:hint="eastAsia"/>
               </w:rPr>
             </w:pPr>
+            <w:proofErr w:type="spellStart"/>
             <w:r>
               <w:rPr>
                 <w:sz w:val="17"/>
               </w:rPr>
               <w:t>reviewed_at</w:t>
             </w:r>
+            <w:proofErr w:type="spellEnd"/>
           </w:p>
         </w:tc>
         <w:tc>
@@ -47878,9 +48279,16 @@
     </w:p>
     <w:tbl>
       <w:tblPr>
-        <w:tblStyle w:val="a9"/>
         <w:tblW w:w="0" w:type="auto"/>
         <w:jc w:val="center"/>
+        <w:tblBorders>
+          <w:top w:val="single" w:sz="4" w:space="0" w:color="auto"/>
+          <w:left w:val="single" w:sz="4" w:space="0" w:color="auto"/>
+          <w:bottom w:val="single" w:sz="4" w:space="0" w:color="auto"/>
+          <w:right w:val="single" w:sz="4" w:space="0" w:color="auto"/>
+          <w:insideH w:val="single" w:sz="4" w:space="0" w:color="auto"/>
+          <w:insideV w:val="single" w:sz="4" w:space="0" w:color="auto"/>
+        </w:tblBorders>
         <w:tblLayout w:type="fixed"/>
         <w:tblLook w:val="04A0" w:firstRow="1" w:lastRow="0" w:firstColumn="1" w:lastColumn="0" w:noHBand="0" w:noVBand="1"/>
       </w:tblPr>
@@ -48055,12 +48463,14 @@
                 <w:rFonts w:hint="eastAsia"/>
               </w:rPr>
             </w:pPr>
+            <w:proofErr w:type="spellStart"/>
             <w:r>
               <w:rPr>
                 <w:sz w:val="17"/>
               </w:rPr>
               <w:t>content_id</w:t>
             </w:r>
+            <w:proofErr w:type="spellEnd"/>
           </w:p>
         </w:tc>
         <w:tc>
@@ -48187,12 +48597,14 @@
                 <w:rFonts w:hint="eastAsia"/>
               </w:rPr>
             </w:pPr>
+            <w:proofErr w:type="spellStart"/>
             <w:r>
               <w:rPr>
                 <w:sz w:val="17"/>
               </w:rPr>
               <w:t>group_id</w:t>
             </w:r>
+            <w:proofErr w:type="spellEnd"/>
           </w:p>
         </w:tc>
         <w:tc>
@@ -48451,12 +48863,14 @@
                 <w:rFonts w:hint="eastAsia"/>
               </w:rPr>
             </w:pPr>
+            <w:proofErr w:type="spellStart"/>
             <w:r>
               <w:rPr>
                 <w:sz w:val="17"/>
               </w:rPr>
               <w:t>business_id</w:t>
             </w:r>
+            <w:proofErr w:type="spellEnd"/>
           </w:p>
         </w:tc>
         <w:tc>
@@ -48583,12 +48997,14 @@
                 <w:rFonts w:hint="eastAsia"/>
               </w:rPr>
             </w:pPr>
+            <w:proofErr w:type="spellStart"/>
             <w:r>
               <w:rPr>
                 <w:sz w:val="17"/>
               </w:rPr>
               <w:t>author_id</w:t>
             </w:r>
+            <w:proofErr w:type="spellEnd"/>
           </w:p>
         </w:tc>
         <w:tc>
@@ -49005,9 +49421,16 @@
     </w:p>
     <w:tbl>
       <w:tblPr>
-        <w:tblStyle w:val="a9"/>
         <w:tblW w:w="0" w:type="auto"/>
         <w:jc w:val="center"/>
+        <w:tblBorders>
+          <w:top w:val="single" w:sz="4" w:space="0" w:color="auto"/>
+          <w:left w:val="single" w:sz="4" w:space="0" w:color="auto"/>
+          <w:bottom w:val="single" w:sz="4" w:space="0" w:color="auto"/>
+          <w:right w:val="single" w:sz="4" w:space="0" w:color="auto"/>
+          <w:insideH w:val="single" w:sz="4" w:space="0" w:color="auto"/>
+          <w:insideV w:val="single" w:sz="4" w:space="0" w:color="auto"/>
+        </w:tblBorders>
         <w:tblLayout w:type="fixed"/>
         <w:tblLook w:val="04A0" w:firstRow="1" w:lastRow="0" w:firstColumn="1" w:lastColumn="0" w:noHBand="0" w:noVBand="1"/>
       </w:tblPr>
@@ -49182,6 +49605,7 @@
                 <w:rFonts w:hint="eastAsia"/>
               </w:rPr>
             </w:pPr>
+            <w:proofErr w:type="spellStart"/>
             <w:r>
               <w:rPr>
                 <w:sz w:val="17"/>
@@ -49189,6 +49613,7 @@
               <w:lastRenderedPageBreak/>
               <w:t>notification_id</w:t>
             </w:r>
+            <w:proofErr w:type="spellEnd"/>
           </w:p>
         </w:tc>
         <w:tc>
@@ -49315,12 +49740,14 @@
                 <w:rFonts w:hint="eastAsia"/>
               </w:rPr>
             </w:pPr>
+            <w:proofErr w:type="spellStart"/>
             <w:r>
               <w:rPr>
                 <w:sz w:val="17"/>
               </w:rPr>
               <w:t>recipient_id</w:t>
             </w:r>
+            <w:proofErr w:type="spellEnd"/>
           </w:p>
         </w:tc>
         <w:tc>
@@ -49447,12 +49874,14 @@
                 <w:rFonts w:hint="eastAsia"/>
               </w:rPr>
             </w:pPr>
+            <w:proofErr w:type="spellStart"/>
             <w:r>
               <w:rPr>
                 <w:sz w:val="17"/>
               </w:rPr>
               <w:t>event_key</w:t>
             </w:r>
+            <w:proofErr w:type="spellEnd"/>
           </w:p>
         </w:tc>
         <w:tc>
@@ -49711,12 +50140,14 @@
                 <w:rFonts w:hint="eastAsia"/>
               </w:rPr>
             </w:pPr>
+            <w:proofErr w:type="spellStart"/>
             <w:r>
               <w:rPr>
                 <w:sz w:val="17"/>
               </w:rPr>
               <w:t>business_id</w:t>
             </w:r>
+            <w:proofErr w:type="spellEnd"/>
           </w:p>
         </w:tc>
         <w:tc>
@@ -49843,12 +50274,14 @@
                 <w:rFonts w:hint="eastAsia"/>
               </w:rPr>
             </w:pPr>
+            <w:proofErr w:type="spellStart"/>
             <w:r>
               <w:rPr>
                 <w:sz w:val="17"/>
               </w:rPr>
               <w:t>is_read</w:t>
             </w:r>
+            <w:proofErr w:type="spellEnd"/>
           </w:p>
         </w:tc>
         <w:tc>
@@ -49975,12 +50408,14 @@
                 <w:rFonts w:hint="eastAsia"/>
               </w:rPr>
             </w:pPr>
+            <w:proofErr w:type="spellStart"/>
             <w:r>
               <w:rPr>
                 <w:sz w:val="17"/>
               </w:rPr>
               <w:t>created_at</w:t>
             </w:r>
+            <w:proofErr w:type="spellEnd"/>
           </w:p>
         </w:tc>
         <w:tc>
@@ -50133,9 +50568,16 @@
     </w:p>
     <w:tbl>
       <w:tblPr>
-        <w:tblStyle w:val="a9"/>
         <w:tblW w:w="0" w:type="auto"/>
         <w:jc w:val="center"/>
+        <w:tblBorders>
+          <w:top w:val="single" w:sz="4" w:space="0" w:color="auto"/>
+          <w:left w:val="single" w:sz="4" w:space="0" w:color="auto"/>
+          <w:bottom w:val="single" w:sz="4" w:space="0" w:color="auto"/>
+          <w:right w:val="single" w:sz="4" w:space="0" w:color="auto"/>
+          <w:insideH w:val="single" w:sz="4" w:space="0" w:color="auto"/>
+          <w:insideV w:val="single" w:sz="4" w:space="0" w:color="auto"/>
+        </w:tblBorders>
         <w:tblLayout w:type="fixed"/>
         <w:tblLook w:val="04A0" w:firstRow="1" w:lastRow="0" w:firstColumn="1" w:lastColumn="0" w:noHBand="0" w:noVBand="1"/>
       </w:tblPr>
@@ -50310,12 +50752,14 @@
                 <w:rFonts w:hint="eastAsia"/>
               </w:rPr>
             </w:pPr>
+            <w:proofErr w:type="spellStart"/>
             <w:r>
               <w:rPr>
                 <w:sz w:val="17"/>
               </w:rPr>
               <w:t>object_id</w:t>
             </w:r>
+            <w:proofErr w:type="spellEnd"/>
           </w:p>
         </w:tc>
         <w:tc>
@@ -50442,12 +50886,14 @@
                 <w:rFonts w:hint="eastAsia"/>
               </w:rPr>
             </w:pPr>
+            <w:proofErr w:type="spellStart"/>
             <w:r>
               <w:rPr>
                 <w:sz w:val="17"/>
               </w:rPr>
               <w:t>storage_key</w:t>
             </w:r>
+            <w:proofErr w:type="spellEnd"/>
           </w:p>
         </w:tc>
         <w:tc>
@@ -50574,12 +51020,14 @@
                 <w:rFonts w:hint="eastAsia"/>
               </w:rPr>
             </w:pPr>
+            <w:proofErr w:type="spellStart"/>
             <w:r>
               <w:rPr>
                 <w:sz w:val="17"/>
               </w:rPr>
               <w:t>original_name</w:t>
             </w:r>
+            <w:proofErr w:type="spellEnd"/>
           </w:p>
         </w:tc>
         <w:tc>
@@ -50838,12 +51286,14 @@
                 <w:rFonts w:hint="eastAsia"/>
               </w:rPr>
             </w:pPr>
+            <w:proofErr w:type="spellStart"/>
             <w:r>
               <w:rPr>
                 <w:sz w:val="17"/>
               </w:rPr>
               <w:t>mime_type</w:t>
             </w:r>
+            <w:proofErr w:type="spellEnd"/>
           </w:p>
         </w:tc>
         <w:tc>
@@ -51260,9 +51710,16 @@
     </w:p>
     <w:tbl>
       <w:tblPr>
-        <w:tblStyle w:val="a9"/>
         <w:tblW w:w="0" w:type="auto"/>
         <w:jc w:val="center"/>
+        <w:tblBorders>
+          <w:top w:val="single" w:sz="4" w:space="0" w:color="auto"/>
+          <w:left w:val="single" w:sz="4" w:space="0" w:color="auto"/>
+          <w:bottom w:val="single" w:sz="4" w:space="0" w:color="auto"/>
+          <w:right w:val="single" w:sz="4" w:space="0" w:color="auto"/>
+          <w:insideH w:val="single" w:sz="4" w:space="0" w:color="auto"/>
+          <w:insideV w:val="single" w:sz="4" w:space="0" w:color="auto"/>
+        </w:tblBorders>
         <w:tblLayout w:type="fixed"/>
         <w:tblLook w:val="04A0" w:firstRow="1" w:lastRow="0" w:firstColumn="1" w:lastColumn="0" w:noHBand="0" w:noVBand="1"/>
       </w:tblPr>
@@ -51437,12 +51894,14 @@
                 <w:rFonts w:hint="eastAsia"/>
               </w:rPr>
             </w:pPr>
+            <w:proofErr w:type="spellStart"/>
             <w:r>
               <w:rPr>
                 <w:sz w:val="17"/>
               </w:rPr>
               <w:t>file_id</w:t>
             </w:r>
+            <w:proofErr w:type="spellEnd"/>
           </w:p>
         </w:tc>
         <w:tc>
@@ -51569,12 +52028,14 @@
                 <w:rFonts w:hint="eastAsia"/>
               </w:rPr>
             </w:pPr>
+            <w:proofErr w:type="spellStart"/>
             <w:r>
               <w:rPr>
                 <w:sz w:val="17"/>
               </w:rPr>
               <w:t>group_id</w:t>
             </w:r>
+            <w:proofErr w:type="spellEnd"/>
           </w:p>
         </w:tc>
         <w:tc>
@@ -51701,12 +52162,14 @@
                 <w:rFonts w:hint="eastAsia"/>
               </w:rPr>
             </w:pPr>
+            <w:proofErr w:type="spellStart"/>
             <w:r>
               <w:rPr>
                 <w:sz w:val="17"/>
               </w:rPr>
               <w:t>object_id</w:t>
             </w:r>
+            <w:proofErr w:type="spellEnd"/>
           </w:p>
         </w:tc>
         <w:tc>
@@ -51965,12 +52428,14 @@
                 <w:rFonts w:hint="eastAsia"/>
               </w:rPr>
             </w:pPr>
+            <w:proofErr w:type="spellStart"/>
             <w:r>
               <w:rPr>
                 <w:sz w:val="17"/>
               </w:rPr>
               <w:t>uploader_id</w:t>
             </w:r>
+            <w:proofErr w:type="spellEnd"/>
           </w:p>
         </w:tc>
         <w:tc>
@@ -52097,12 +52562,14 @@
                 <w:rFonts w:hint="eastAsia"/>
               </w:rPr>
             </w:pPr>
+            <w:proofErr w:type="spellStart"/>
             <w:r>
               <w:rPr>
                 <w:sz w:val="17"/>
               </w:rPr>
               <w:t>source_type</w:t>
             </w:r>
+            <w:proofErr w:type="spellEnd"/>
           </w:p>
         </w:tc>
         <w:tc>
@@ -52229,6 +52696,7 @@
                 <w:rFonts w:hint="eastAsia"/>
               </w:rPr>
             </w:pPr>
+            <w:proofErr w:type="spellStart"/>
             <w:r>
               <w:rPr>
                 <w:sz w:val="17"/>
@@ -52236,6 +52704,7 @@
               <w:lastRenderedPageBreak/>
               <w:t>source_id</w:t>
             </w:r>
+            <w:proofErr w:type="spellEnd"/>
           </w:p>
         </w:tc>
         <w:tc>
@@ -52388,9 +52857,16 @@
     </w:p>
     <w:tbl>
       <w:tblPr>
-        <w:tblStyle w:val="a9"/>
         <w:tblW w:w="0" w:type="auto"/>
         <w:jc w:val="center"/>
+        <w:tblBorders>
+          <w:top w:val="single" w:sz="4" w:space="0" w:color="auto"/>
+          <w:left w:val="single" w:sz="4" w:space="0" w:color="auto"/>
+          <w:bottom w:val="single" w:sz="4" w:space="0" w:color="auto"/>
+          <w:right w:val="single" w:sz="4" w:space="0" w:color="auto"/>
+          <w:insideH w:val="single" w:sz="4" w:space="0" w:color="auto"/>
+          <w:insideV w:val="single" w:sz="4" w:space="0" w:color="auto"/>
+        </w:tblBorders>
         <w:tblLayout w:type="fixed"/>
         <w:tblLook w:val="04A0" w:firstRow="1" w:lastRow="0" w:firstColumn="1" w:lastColumn="0" w:noHBand="0" w:noVBand="1"/>
       </w:tblPr>
@@ -52565,12 +53041,14 @@
                 <w:rFonts w:hint="eastAsia"/>
               </w:rPr>
             </w:pPr>
+            <w:proofErr w:type="spellStart"/>
             <w:r>
               <w:rPr>
                 <w:sz w:val="17"/>
               </w:rPr>
               <w:t>share_id</w:t>
             </w:r>
+            <w:proofErr w:type="spellEnd"/>
           </w:p>
         </w:tc>
         <w:tc>
@@ -52697,12 +53175,14 @@
                 <w:rFonts w:hint="eastAsia"/>
               </w:rPr>
             </w:pPr>
+            <w:proofErr w:type="spellStart"/>
             <w:r>
               <w:rPr>
                 <w:sz w:val="17"/>
               </w:rPr>
               <w:t>owner_id</w:t>
             </w:r>
+            <w:proofErr w:type="spellEnd"/>
           </w:p>
         </w:tc>
         <w:tc>
@@ -52829,12 +53309,14 @@
                 <w:rFonts w:hint="eastAsia"/>
               </w:rPr>
             </w:pPr>
+            <w:proofErr w:type="spellStart"/>
             <w:r>
               <w:rPr>
                 <w:sz w:val="17"/>
               </w:rPr>
               <w:t>object_id</w:t>
             </w:r>
+            <w:proofErr w:type="spellEnd"/>
           </w:p>
         </w:tc>
         <w:tc>
@@ -52961,12 +53443,14 @@
                 <w:rFonts w:hint="eastAsia"/>
               </w:rPr>
             </w:pPr>
+            <w:proofErr w:type="spellStart"/>
             <w:r>
               <w:rPr>
                 <w:sz w:val="17"/>
               </w:rPr>
               <w:t>pickup_code_hash</w:t>
             </w:r>
+            <w:proofErr w:type="spellEnd"/>
           </w:p>
         </w:tc>
         <w:tc>
@@ -53093,12 +53577,14 @@
                 <w:rFonts w:hint="eastAsia"/>
               </w:rPr>
             </w:pPr>
+            <w:proofErr w:type="spellStart"/>
             <w:r>
               <w:rPr>
                 <w:sz w:val="17"/>
               </w:rPr>
               <w:t>expires_at</w:t>
             </w:r>
+            <w:proofErr w:type="spellEnd"/>
           </w:p>
         </w:tc>
         <w:tc>
@@ -53225,12 +53711,14 @@
                 <w:rFonts w:hint="eastAsia"/>
               </w:rPr>
             </w:pPr>
+            <w:proofErr w:type="spellStart"/>
             <w:r>
               <w:rPr>
                 <w:sz w:val="17"/>
               </w:rPr>
               <w:t>remaining_downloads</w:t>
             </w:r>
+            <w:proofErr w:type="spellEnd"/>
           </w:p>
         </w:tc>
         <w:tc>
@@ -53515,9 +54003,16 @@
     </w:p>
     <w:tbl>
       <w:tblPr>
-        <w:tblStyle w:val="a9"/>
         <w:tblW w:w="0" w:type="auto"/>
         <w:jc w:val="center"/>
+        <w:tblBorders>
+          <w:top w:val="single" w:sz="4" w:space="0" w:color="auto"/>
+          <w:left w:val="single" w:sz="4" w:space="0" w:color="auto"/>
+          <w:bottom w:val="single" w:sz="4" w:space="0" w:color="auto"/>
+          <w:right w:val="single" w:sz="4" w:space="0" w:color="auto"/>
+          <w:insideH w:val="single" w:sz="4" w:space="0" w:color="auto"/>
+          <w:insideV w:val="single" w:sz="4" w:space="0" w:color="auto"/>
+        </w:tblBorders>
         <w:tblLayout w:type="fixed"/>
         <w:tblLook w:val="04A0" w:firstRow="1" w:lastRow="0" w:firstColumn="1" w:lastColumn="0" w:noHBand="0" w:noVBand="1"/>
       </w:tblPr>
@@ -53692,12 +54187,14 @@
                 <w:rFonts w:hint="eastAsia"/>
               </w:rPr>
             </w:pPr>
+            <w:proofErr w:type="spellStart"/>
             <w:r>
               <w:rPr>
                 <w:sz w:val="17"/>
               </w:rPr>
               <w:t>device_item_id</w:t>
             </w:r>
+            <w:proofErr w:type="spellEnd"/>
           </w:p>
         </w:tc>
         <w:tc>
@@ -53824,12 +54321,14 @@
                 <w:rFonts w:hint="eastAsia"/>
               </w:rPr>
             </w:pPr>
+            <w:proofErr w:type="spellStart"/>
             <w:r>
               <w:rPr>
                 <w:sz w:val="17"/>
               </w:rPr>
               <w:t>owner_id</w:t>
             </w:r>
+            <w:proofErr w:type="spellEnd"/>
           </w:p>
         </w:tc>
         <w:tc>
@@ -54220,12 +54719,14 @@
                 <w:rFonts w:hint="eastAsia"/>
               </w:rPr>
             </w:pPr>
+            <w:proofErr w:type="spellStart"/>
             <w:r>
               <w:rPr>
                 <w:sz w:val="17"/>
               </w:rPr>
               <w:t>object_id</w:t>
             </w:r>
+            <w:proofErr w:type="spellEnd"/>
           </w:p>
         </w:tc>
         <w:tc>
@@ -54352,12 +54853,14 @@
                 <w:rFonts w:hint="eastAsia"/>
               </w:rPr>
             </w:pPr>
+            <w:proofErr w:type="spellStart"/>
             <w:r>
               <w:rPr>
                 <w:sz w:val="17"/>
               </w:rPr>
               <w:t>created_at</w:t>
             </w:r>
+            <w:proofErr w:type="spellEnd"/>
           </w:p>
         </w:tc>
         <w:tc>
@@ -54484,12 +54987,14 @@
                 <w:rFonts w:hint="eastAsia"/>
               </w:rPr>
             </w:pPr>
+            <w:proofErr w:type="spellStart"/>
             <w:r>
               <w:rPr>
                 <w:sz w:val="17"/>
               </w:rPr>
               <w:t>deleted_at</w:t>
             </w:r>
+            <w:proofErr w:type="spellEnd"/>
           </w:p>
         </w:tc>
         <w:tc>
@@ -54642,9 +55147,16 @@
     </w:p>
     <w:tbl>
       <w:tblPr>
-        <w:tblStyle w:val="a9"/>
         <w:tblW w:w="0" w:type="auto"/>
         <w:jc w:val="center"/>
+        <w:tblBorders>
+          <w:top w:val="single" w:sz="4" w:space="0" w:color="auto"/>
+          <w:left w:val="single" w:sz="4" w:space="0" w:color="auto"/>
+          <w:bottom w:val="single" w:sz="4" w:space="0" w:color="auto"/>
+          <w:right w:val="single" w:sz="4" w:space="0" w:color="auto"/>
+          <w:insideH w:val="single" w:sz="4" w:space="0" w:color="auto"/>
+          <w:insideV w:val="single" w:sz="4" w:space="0" w:color="auto"/>
+        </w:tblBorders>
         <w:tblLayout w:type="fixed"/>
         <w:tblLook w:val="04A0" w:firstRow="1" w:lastRow="0" w:firstColumn="1" w:lastColumn="0" w:noHBand="0" w:noVBand="1"/>
       </w:tblPr>
@@ -54819,6 +55331,7 @@
                 <w:rFonts w:hint="eastAsia"/>
               </w:rPr>
             </w:pPr>
+            <w:proofErr w:type="spellStart"/>
             <w:r>
               <w:rPr>
                 <w:sz w:val="17"/>
@@ -54826,6 +55339,7 @@
               <w:lastRenderedPageBreak/>
               <w:t>log_id</w:t>
             </w:r>
+            <w:proofErr w:type="spellEnd"/>
           </w:p>
         </w:tc>
         <w:tc>
@@ -54952,12 +55466,14 @@
                 <w:rFonts w:hint="eastAsia"/>
               </w:rPr>
             </w:pPr>
+            <w:proofErr w:type="spellStart"/>
             <w:r>
               <w:rPr>
                 <w:sz w:val="17"/>
               </w:rPr>
               <w:t>actor_id</w:t>
             </w:r>
+            <w:proofErr w:type="spellEnd"/>
           </w:p>
         </w:tc>
         <w:tc>
@@ -55084,12 +55600,14 @@
                 <w:rFonts w:hint="eastAsia"/>
               </w:rPr>
             </w:pPr>
+            <w:proofErr w:type="spellStart"/>
             <w:r>
               <w:rPr>
                 <w:sz w:val="17"/>
               </w:rPr>
               <w:t>group_id</w:t>
             </w:r>
+            <w:proofErr w:type="spellEnd"/>
           </w:p>
         </w:tc>
         <w:tc>
@@ -55348,12 +55866,14 @@
                 <w:rFonts w:hint="eastAsia"/>
               </w:rPr>
             </w:pPr>
+            <w:proofErr w:type="spellStart"/>
             <w:r>
               <w:rPr>
                 <w:sz w:val="17"/>
               </w:rPr>
               <w:t>target_type</w:t>
             </w:r>
+            <w:proofErr w:type="spellEnd"/>
           </w:p>
         </w:tc>
         <w:tc>
@@ -55480,12 +56000,14 @@
                 <w:rFonts w:hint="eastAsia"/>
               </w:rPr>
             </w:pPr>
+            <w:proofErr w:type="spellStart"/>
             <w:r>
               <w:rPr>
                 <w:sz w:val="17"/>
               </w:rPr>
               <w:t>target_id</w:t>
             </w:r>
+            <w:proofErr w:type="spellEnd"/>
           </w:p>
         </w:tc>
         <w:tc>
@@ -55744,12 +56266,14 @@
                 <w:rFonts w:hint="eastAsia"/>
               </w:rPr>
             </w:pPr>
+            <w:proofErr w:type="spellStart"/>
             <w:r>
               <w:rPr>
                 <w:sz w:val="17"/>
               </w:rPr>
               <w:t>created_at</w:t>
             </w:r>
+            <w:proofErr w:type="spellEnd"/>
           </w:p>
         </w:tc>
         <w:tc>
@@ -55895,7 +56419,21 @@
         <w:rPr>
           <w:sz w:val="23"/>
         </w:rPr>
-        <w:t>• 所有小组业务表必须包含 group_id 或通过不可歧义的关联路径确定所属小组。</w:t>
+        <w:t xml:space="preserve">• 所有小组业务表必须包含 </w:t>
+      </w:r>
+      <w:proofErr w:type="spellStart"/>
+      <w:r>
+        <w:rPr>
+          <w:sz w:val="23"/>
+        </w:rPr>
+        <w:t>group_id</w:t>
+      </w:r>
+      <w:proofErr w:type="spellEnd"/>
+      <w:r>
+        <w:rPr>
+          <w:sz w:val="23"/>
+        </w:rPr>
+        <w:t xml:space="preserve"> 或通过不可歧义的关联路径确定所属小组。</w:t>
       </w:r>
     </w:p>
     <w:p>
@@ -55955,7 +56493,35 @@
         <w:rPr>
           <w:sz w:val="23"/>
         </w:rPr>
-        <w:t>• 核心表应记录 created_at、updated_at，关键变更应记录 actor 与审计日志。</w:t>
+        <w:t xml:space="preserve">• 核心表应记录 </w:t>
+      </w:r>
+      <w:proofErr w:type="spellStart"/>
+      <w:r>
+        <w:rPr>
+          <w:sz w:val="23"/>
+        </w:rPr>
+        <w:t>created_at</w:t>
+      </w:r>
+      <w:proofErr w:type="spellEnd"/>
+      <w:r>
+        <w:rPr>
+          <w:sz w:val="23"/>
+        </w:rPr>
+        <w:t>、</w:t>
+      </w:r>
+      <w:proofErr w:type="spellStart"/>
+      <w:r>
+        <w:rPr>
+          <w:sz w:val="23"/>
+        </w:rPr>
+        <w:t>updated_at</w:t>
+      </w:r>
+      <w:proofErr w:type="spellEnd"/>
+      <w:r>
+        <w:rPr>
+          <w:sz w:val="23"/>
+        </w:rPr>
+        <w:t>，关键变更应记录 actor 与审计日志。</w:t>
       </w:r>
     </w:p>
     <w:p>
@@ -56075,9 +56641,16 @@
     </w:p>
     <w:tbl>
       <w:tblPr>
-        <w:tblStyle w:val="a9"/>
         <w:tblW w:w="0" w:type="auto"/>
         <w:jc w:val="center"/>
+        <w:tblBorders>
+          <w:top w:val="single" w:sz="4" w:space="0" w:color="auto"/>
+          <w:left w:val="single" w:sz="4" w:space="0" w:color="auto"/>
+          <w:bottom w:val="single" w:sz="4" w:space="0" w:color="auto"/>
+          <w:right w:val="single" w:sz="4" w:space="0" w:color="auto"/>
+          <w:insideH w:val="single" w:sz="4" w:space="0" w:color="auto"/>
+          <w:insideV w:val="single" w:sz="4" w:space="0" w:color="auto"/>
+        </w:tblBorders>
         <w:tblLayout w:type="fixed"/>
         <w:tblLook w:val="04A0" w:firstRow="1" w:lastRow="0" w:firstColumn="1" w:lastColumn="0" w:noHBand="0" w:noVBand="1"/>
       </w:tblPr>
@@ -56490,9 +57063,16 @@
     </w:p>
     <w:tbl>
       <w:tblPr>
-        <w:tblStyle w:val="a9"/>
         <w:tblW w:w="0" w:type="auto"/>
         <w:jc w:val="center"/>
+        <w:tblBorders>
+          <w:top w:val="single" w:sz="4" w:space="0" w:color="auto"/>
+          <w:left w:val="single" w:sz="4" w:space="0" w:color="auto"/>
+          <w:bottom w:val="single" w:sz="4" w:space="0" w:color="auto"/>
+          <w:right w:val="single" w:sz="4" w:space="0" w:color="auto"/>
+          <w:insideH w:val="single" w:sz="4" w:space="0" w:color="auto"/>
+          <w:insideV w:val="single" w:sz="4" w:space="0" w:color="auto"/>
+        </w:tblBorders>
         <w:tblLayout w:type="fixed"/>
         <w:tblLook w:val="04A0" w:firstRow="1" w:lastRow="0" w:firstColumn="1" w:lastColumn="0" w:noHBand="0" w:noVBand="1"/>
       </w:tblPr>
@@ -57687,9 +58267,16 @@
     </w:p>
     <w:tbl>
       <w:tblPr>
-        <w:tblStyle w:val="a9"/>
         <w:tblW w:w="0" w:type="auto"/>
         <w:jc w:val="center"/>
+        <w:tblBorders>
+          <w:top w:val="single" w:sz="4" w:space="0" w:color="auto"/>
+          <w:left w:val="single" w:sz="4" w:space="0" w:color="auto"/>
+          <w:bottom w:val="single" w:sz="4" w:space="0" w:color="auto"/>
+          <w:right w:val="single" w:sz="4" w:space="0" w:color="auto"/>
+          <w:insideH w:val="single" w:sz="4" w:space="0" w:color="auto"/>
+          <w:insideV w:val="single" w:sz="4" w:space="0" w:color="auto"/>
+        </w:tblBorders>
         <w:tblLayout w:type="fixed"/>
         <w:tblLook w:val="04A0" w:firstRow="1" w:lastRow="0" w:firstColumn="1" w:lastColumn="0" w:noHBand="0" w:noVBand="1"/>
       </w:tblPr>
@@ -58055,9 +58642,16 @@
     </w:p>
     <w:tbl>
       <w:tblPr>
-        <w:tblStyle w:val="a9"/>
         <w:tblW w:w="0" w:type="auto"/>
         <w:jc w:val="center"/>
+        <w:tblBorders>
+          <w:top w:val="single" w:sz="4" w:space="0" w:color="auto"/>
+          <w:left w:val="single" w:sz="4" w:space="0" w:color="auto"/>
+          <w:bottom w:val="single" w:sz="4" w:space="0" w:color="auto"/>
+          <w:right w:val="single" w:sz="4" w:space="0" w:color="auto"/>
+          <w:insideH w:val="single" w:sz="4" w:space="0" w:color="auto"/>
+          <w:insideV w:val="single" w:sz="4" w:space="0" w:color="auto"/>
+        </w:tblBorders>
         <w:tblLayout w:type="fixed"/>
         <w:tblLook w:val="04A0" w:firstRow="1" w:lastRow="0" w:firstColumn="1" w:lastColumn="0" w:noHBand="0" w:noVBand="1"/>
       </w:tblPr>
@@ -58450,9 +59044,16 @@
     </w:p>
     <w:tbl>
       <w:tblPr>
-        <w:tblStyle w:val="a9"/>
         <w:tblW w:w="0" w:type="auto"/>
         <w:jc w:val="center"/>
+        <w:tblBorders>
+          <w:top w:val="single" w:sz="4" w:space="0" w:color="auto"/>
+          <w:left w:val="single" w:sz="4" w:space="0" w:color="auto"/>
+          <w:bottom w:val="single" w:sz="4" w:space="0" w:color="auto"/>
+          <w:right w:val="single" w:sz="4" w:space="0" w:color="auto"/>
+          <w:insideH w:val="single" w:sz="4" w:space="0" w:color="auto"/>
+          <w:insideV w:val="single" w:sz="4" w:space="0" w:color="auto"/>
+        </w:tblBorders>
         <w:tblLayout w:type="fixed"/>
         <w:tblLook w:val="04A0" w:firstRow="1" w:lastRow="0" w:firstColumn="1" w:lastColumn="0" w:noHBand="0" w:noVBand="1"/>
       </w:tblPr>
@@ -62125,9 +62726,16 @@
     </w:p>
     <w:tbl>
       <w:tblPr>
-        <w:tblStyle w:val="a9"/>
         <w:tblW w:w="0" w:type="auto"/>
         <w:jc w:val="center"/>
+        <w:tblBorders>
+          <w:top w:val="single" w:sz="4" w:space="0" w:color="auto"/>
+          <w:left w:val="single" w:sz="4" w:space="0" w:color="auto"/>
+          <w:bottom w:val="single" w:sz="4" w:space="0" w:color="auto"/>
+          <w:right w:val="single" w:sz="4" w:space="0" w:color="auto"/>
+          <w:insideH w:val="single" w:sz="4" w:space="0" w:color="auto"/>
+          <w:insideV w:val="single" w:sz="4" w:space="0" w:color="auto"/>
+        </w:tblBorders>
         <w:tblLayout w:type="fixed"/>
         <w:tblLook w:val="04A0" w:firstRow="1" w:lastRow="0" w:firstColumn="1" w:lastColumn="0" w:noHBand="0" w:noVBand="1"/>
       </w:tblPr>
@@ -62643,9 +63251,16 @@
     </w:p>
     <w:tbl>
       <w:tblPr>
-        <w:tblStyle w:val="a9"/>
         <w:tblW w:w="0" w:type="auto"/>
         <w:jc w:val="center"/>
+        <w:tblBorders>
+          <w:top w:val="single" w:sz="4" w:space="0" w:color="auto"/>
+          <w:left w:val="single" w:sz="4" w:space="0" w:color="auto"/>
+          <w:bottom w:val="single" w:sz="4" w:space="0" w:color="auto"/>
+          <w:right w:val="single" w:sz="4" w:space="0" w:color="auto"/>
+          <w:insideH w:val="single" w:sz="4" w:space="0" w:color="auto"/>
+          <w:insideV w:val="single" w:sz="4" w:space="0" w:color="auto"/>
+        </w:tblBorders>
         <w:tblLayout w:type="fixed"/>
         <w:tblLook w:val="04A0" w:firstRow="1" w:lastRow="0" w:firstColumn="1" w:lastColumn="0" w:noHBand="0" w:noVBand="1"/>
       </w:tblPr>
@@ -63253,9 +63868,16 @@
     </w:p>
     <w:tbl>
       <w:tblPr>
-        <w:tblStyle w:val="a9"/>
         <w:tblW w:w="0" w:type="auto"/>
         <w:jc w:val="center"/>
+        <w:tblBorders>
+          <w:top w:val="single" w:sz="4" w:space="0" w:color="auto"/>
+          <w:left w:val="single" w:sz="4" w:space="0" w:color="auto"/>
+          <w:bottom w:val="single" w:sz="4" w:space="0" w:color="auto"/>
+          <w:right w:val="single" w:sz="4" w:space="0" w:color="auto"/>
+          <w:insideH w:val="single" w:sz="4" w:space="0" w:color="auto"/>
+          <w:insideV w:val="single" w:sz="4" w:space="0" w:color="auto"/>
+        </w:tblBorders>
         <w:tblLayout w:type="fixed"/>
         <w:tblLook w:val="04A0" w:firstRow="1" w:lastRow="0" w:firstColumn="1" w:lastColumn="0" w:noHBand="0" w:noVBand="1"/>
       </w:tblPr>
@@ -64743,7 +65365,6 @@
   </w:style>
   <w:style w:type="character" w:customStyle="1" w:styleId="20">
     <w:name w:val="标题 2 字符"/>
-    <w:basedOn w:val="a1"/>
     <w:link w:val="2"/>
     <w:rPr>
       <w:rFonts w:ascii="Arial" w:eastAsia="黑体" w:hAnsi="Arial"/>
@@ -64844,7 +65465,6 @@
   </w:style>
   <w:style w:type="character" w:styleId="aa">
     <w:name w:val="Strong"/>
-    <w:basedOn w:val="a1"/>
     <w:qFormat/>
     <w:rPr>
       <w:b/>
@@ -64852,7 +65472,6 @@
   </w:style>
   <w:style w:type="character" w:styleId="ab">
     <w:name w:val="Hyperlink"/>
-    <w:basedOn w:val="a1"/>
     <w:uiPriority w:val="99"/>
     <w:rPr>
       <w:color w:val="0000FF"/>
@@ -64861,7 +65480,6 @@
   </w:style>
   <w:style w:type="character" w:customStyle="1" w:styleId="585Char">
     <w:name w:val="正文（585） Char"/>
-    <w:basedOn w:val="a1"/>
     <w:link w:val="585"/>
     <w:rPr>
       <w:rFonts w:eastAsia="宋体"/>

</xml_diff>